<commit_message>
Align manager stats with SecId product scope
</commit_message>
<xml_diff>
--- a/海外ETF期权及衍生策略产品研究0618_更新版.docx
+++ b/海外ETF期权及衍生策略产品研究0618_更新版.docx
@@ -10050,7 +10050,7 @@
           <w:color w:val="000000"/>
           <w:sz w:val="22"/>
         </w:rPr>
-        <w:t>在使用期权的衍生策略ETF领域，管理人竞争格局呈现高度集中与深度差异化并存的特征。按AUM排序，前五大管理人分别为JPMorgan、First Trust、Innovator ETFs、NEOS和Global X，五家合计AUM约2199亿美元，占全球使用期权ETF总规模的71.2%。</w:t>
+        <w:t>在使用期权的衍生策略ETF领域，管理人竞争格局呈现高度集中与深度差异化并存的特征。按AUM排序，前五大管理人分别为JPMorgan、First Trust、Innovator ETFs、NEOS和Global X，五家合计AUM约2201亿美元，占全球使用期权ETF总规模的71.1%。</w:t>
       </w:r>
     </w:p>
     <w:p>
@@ -10101,7 +10101,6 @@
           </w:tcPr>
           <w:p>
             <w:pPr>
-              <w:pStyle w:val="affd"/>
               <w:spacing w:before="0" w:after="0" w:line="276" w:lineRule="auto"/>
               <w:jc w:val="center"/>
             </w:pPr>
@@ -10125,7 +10124,6 @@
           </w:tcPr>
           <w:p>
             <w:pPr>
-              <w:pStyle w:val="affd"/>
               <w:spacing w:before="0" w:after="0" w:line="276" w:lineRule="auto"/>
               <w:jc w:val="center"/>
             </w:pPr>
@@ -10149,7 +10147,6 @@
           </w:tcPr>
           <w:p>
             <w:pPr>
-              <w:pStyle w:val="affd"/>
               <w:spacing w:before="0" w:after="0" w:line="276" w:lineRule="auto"/>
               <w:jc w:val="center"/>
             </w:pPr>
@@ -10173,7 +10170,6 @@
           </w:tcPr>
           <w:p>
             <w:pPr>
-              <w:pStyle w:val="affd"/>
               <w:spacing w:before="0" w:after="0" w:line="276" w:lineRule="auto"/>
               <w:jc w:val="center"/>
             </w:pPr>
@@ -10197,7 +10193,6 @@
           </w:tcPr>
           <w:p>
             <w:pPr>
-              <w:pStyle w:val="affd"/>
               <w:spacing w:before="0" w:after="0" w:line="276" w:lineRule="auto"/>
               <w:jc w:val="center"/>
             </w:pPr>
@@ -10221,7 +10216,6 @@
           </w:tcPr>
           <w:p>
             <w:pPr>
-              <w:pStyle w:val="affd"/>
               <w:spacing w:before="0" w:after="0" w:line="276" w:lineRule="auto"/>
               <w:jc w:val="center"/>
             </w:pPr>
@@ -10245,7 +10239,6 @@
           </w:tcPr>
           <w:p>
             <w:pPr>
-              <w:pStyle w:val="affd"/>
               <w:spacing w:before="0" w:after="0" w:line="276" w:lineRule="auto"/>
               <w:jc w:val="center"/>
             </w:pPr>
@@ -10270,7 +10263,6 @@
           </w:tcPr>
           <w:p>
             <w:pPr>
-              <w:pStyle w:val="affd"/>
               <w:spacing w:before="0" w:after="0" w:line="276" w:lineRule="auto"/>
               <w:jc w:val="center"/>
             </w:pPr>
@@ -10293,7 +10285,6 @@
           </w:tcPr>
           <w:p>
             <w:pPr>
-              <w:pStyle w:val="affd"/>
               <w:spacing w:before="0" w:after="0" w:line="276" w:lineRule="auto"/>
               <w:jc w:val="center"/>
             </w:pPr>
@@ -10316,19 +10307,18 @@
           </w:tcPr>
           <w:p>
             <w:pPr>
-              <w:pStyle w:val="affd"/>
-              <w:spacing w:before="0" w:after="0" w:line="276" w:lineRule="auto"/>
-              <w:jc w:val="center"/>
-            </w:pPr>
-            <w:r/>
-            <w:r>
-              <w:rPr>
-                <w:rFonts w:ascii="Times New Roman" w:hAnsi="Times New Roman" w:eastAsia="KaiTi"/>
-                <w:b w:val="0"/>
-                <w:color w:val="000000"/>
-                <w:sz w:val="15"/>
-              </w:rPr>
-              <w:t>8</w:t>
+              <w:spacing w:before="0" w:after="0" w:line="276" w:lineRule="auto"/>
+              <w:jc w:val="center"/>
+            </w:pPr>
+            <w:r/>
+            <w:r>
+              <w:rPr>
+                <w:rFonts w:ascii="Times New Roman" w:hAnsi="Times New Roman" w:eastAsia="KaiTi"/>
+                <w:b w:val="0"/>
+                <w:color w:val="000000"/>
+                <w:sz w:val="15"/>
+              </w:rPr>
+              <w:t>9</w:t>
             </w:r>
           </w:p>
         </w:tc>
@@ -10339,19 +10329,18 @@
           </w:tcPr>
           <w:p>
             <w:pPr>
-              <w:pStyle w:val="affd"/>
-              <w:spacing w:before="0" w:after="0" w:line="276" w:lineRule="auto"/>
-              <w:jc w:val="center"/>
-            </w:pPr>
-            <w:r/>
-            <w:r>
-              <w:rPr>
-                <w:rFonts w:ascii="Times New Roman" w:hAnsi="Times New Roman" w:eastAsia="KaiTi"/>
-                <w:b w:val="0"/>
-                <w:color w:val="000000"/>
-                <w:sz w:val="15"/>
-              </w:rPr>
-              <w:t>896.64</w:t>
+              <w:spacing w:before="0" w:after="0" w:line="276" w:lineRule="auto"/>
+              <w:jc w:val="center"/>
+            </w:pPr>
+            <w:r/>
+            <w:r>
+              <w:rPr>
+                <w:rFonts w:ascii="Times New Roman" w:hAnsi="Times New Roman" w:eastAsia="KaiTi"/>
+                <w:b w:val="0"/>
+                <w:color w:val="000000"/>
+                <w:sz w:val="15"/>
+              </w:rPr>
+              <w:t>896.79</w:t>
             </w:r>
           </w:p>
         </w:tc>
@@ -10362,7 +10351,6 @@
           </w:tcPr>
           <w:p>
             <w:pPr>
-              <w:pStyle w:val="affd"/>
               <w:spacing w:before="0" w:after="0" w:line="276" w:lineRule="auto"/>
               <w:jc w:val="center"/>
             </w:pPr>
@@ -10385,7 +10373,6 @@
           </w:tcPr>
           <w:p>
             <w:pPr>
-              <w:pStyle w:val="affd"/>
               <w:spacing w:before="0" w:after="0" w:line="276" w:lineRule="auto"/>
               <w:jc w:val="center"/>
             </w:pPr>
@@ -10408,19 +10395,18 @@
           </w:tcPr>
           <w:p>
             <w:pPr>
-              <w:pStyle w:val="affd"/>
-              <w:spacing w:before="0" w:after="0" w:line="276" w:lineRule="auto"/>
-              <w:jc w:val="center"/>
-            </w:pPr>
-            <w:r/>
-            <w:r>
-              <w:rPr>
-                <w:rFonts w:ascii="Times New Roman" w:hAnsi="Times New Roman" w:eastAsia="KaiTi"/>
-                <w:b w:val="0"/>
-                <w:color w:val="000000"/>
-                <w:sz w:val="15"/>
-              </w:rPr>
-              <w:t>收益增强5只 另类策略3只</w:t>
+              <w:spacing w:before="0" w:after="0" w:line="276" w:lineRule="auto"/>
+              <w:jc w:val="center"/>
+            </w:pPr>
+            <w:r/>
+            <w:r>
+              <w:rPr>
+                <w:rFonts w:ascii="Times New Roman" w:hAnsi="Times New Roman" w:eastAsia="KaiTi"/>
+                <w:b w:val="0"/>
+                <w:color w:val="000000"/>
+                <w:sz w:val="15"/>
+              </w:rPr>
+              <w:t>收益增强5只 另类策略4只</w:t>
             </w:r>
           </w:p>
         </w:tc>
@@ -10433,7 +10419,6 @@
           </w:tcPr>
           <w:p>
             <w:pPr>
-              <w:pStyle w:val="affd"/>
               <w:spacing w:before="0" w:after="0" w:line="276" w:lineRule="auto"/>
               <w:jc w:val="center"/>
             </w:pPr>
@@ -10456,7 +10441,6 @@
           </w:tcPr>
           <w:p>
             <w:pPr>
-              <w:pStyle w:val="affd"/>
               <w:spacing w:before="0" w:after="0" w:line="276" w:lineRule="auto"/>
               <w:jc w:val="center"/>
             </w:pPr>
@@ -10479,19 +10463,18 @@
           </w:tcPr>
           <w:p>
             <w:pPr>
-              <w:pStyle w:val="affd"/>
-              <w:spacing w:before="0" w:after="0" w:line="276" w:lineRule="auto"/>
-              <w:jc w:val="center"/>
-            </w:pPr>
-            <w:r/>
-            <w:r>
-              <w:rPr>
-                <w:rFonts w:ascii="Times New Roman" w:hAnsi="Times New Roman" w:eastAsia="KaiTi"/>
-                <w:b w:val="0"/>
-                <w:color w:val="000000"/>
-                <w:sz w:val="15"/>
-              </w:rPr>
-              <w:t>142</w:t>
+              <w:spacing w:before="0" w:after="0" w:line="276" w:lineRule="auto"/>
+              <w:jc w:val="center"/>
+            </w:pPr>
+            <w:r/>
+            <w:r>
+              <w:rPr>
+                <w:rFonts w:ascii="Times New Roman" w:hAnsi="Times New Roman" w:eastAsia="KaiTi"/>
+                <w:b w:val="0"/>
+                <w:color w:val="000000"/>
+                <w:sz w:val="15"/>
+              </w:rPr>
+              <w:t>154</w:t>
             </w:r>
           </w:p>
         </w:tc>
@@ -10502,19 +10485,18 @@
           </w:tcPr>
           <w:p>
             <w:pPr>
-              <w:pStyle w:val="affd"/>
-              <w:spacing w:before="0" w:after="0" w:line="276" w:lineRule="auto"/>
-              <w:jc w:val="center"/>
-            </w:pPr>
-            <w:r/>
-            <w:r>
-              <w:rPr>
-                <w:rFonts w:ascii="Times New Roman" w:hAnsi="Times New Roman" w:eastAsia="KaiTi"/>
-                <w:b w:val="0"/>
-                <w:color w:val="000000"/>
-                <w:sz w:val="15"/>
-              </w:rPr>
-              <w:t>594.73</w:t>
+              <w:spacing w:before="0" w:after="0" w:line="276" w:lineRule="auto"/>
+              <w:jc w:val="center"/>
+            </w:pPr>
+            <w:r/>
+            <w:r>
+              <w:rPr>
+                <w:rFonts w:ascii="Times New Roman" w:hAnsi="Times New Roman" w:eastAsia="KaiTi"/>
+                <w:b w:val="0"/>
+                <w:color w:val="000000"/>
+                <w:sz w:val="15"/>
+              </w:rPr>
+              <w:t>596.94</w:t>
             </w:r>
           </w:p>
         </w:tc>
@@ -10525,7 +10507,6 @@
           </w:tcPr>
           <w:p>
             <w:pPr>
-              <w:pStyle w:val="affd"/>
               <w:spacing w:before="0" w:after="0" w:line="276" w:lineRule="auto"/>
               <w:jc w:val="center"/>
             </w:pPr>
@@ -10548,7 +10529,6 @@
           </w:tcPr>
           <w:p>
             <w:pPr>
-              <w:pStyle w:val="affd"/>
               <w:spacing w:before="0" w:after="0" w:line="276" w:lineRule="auto"/>
               <w:jc w:val="center"/>
             </w:pPr>
@@ -10571,19 +10551,18 @@
           </w:tcPr>
           <w:p>
             <w:pPr>
-              <w:pStyle w:val="affd"/>
-              <w:spacing w:before="0" w:after="0" w:line="276" w:lineRule="auto"/>
-              <w:jc w:val="center"/>
-            </w:pPr>
-            <w:r/>
-            <w:r>
-              <w:rPr>
-                <w:rFonts w:ascii="Times New Roman" w:hAnsi="Times New Roman" w:eastAsia="KaiTi"/>
-                <w:b w:val="0"/>
-                <w:color w:val="000000"/>
-                <w:sz w:val="15"/>
-              </w:rPr>
-              <w:t>收益增强16只 风险缓冲124只 另类策略2只</w:t>
+              <w:spacing w:before="0" w:after="0" w:line="276" w:lineRule="auto"/>
+              <w:jc w:val="center"/>
+            </w:pPr>
+            <w:r/>
+            <w:r>
+              <w:rPr>
+                <w:rFonts w:ascii="Times New Roman" w:hAnsi="Times New Roman" w:eastAsia="KaiTi"/>
+                <w:b w:val="0"/>
+                <w:color w:val="000000"/>
+                <w:sz w:val="15"/>
+              </w:rPr>
+              <w:t>收益增强16只 风险缓冲136只 另类策略2只</w:t>
             </w:r>
           </w:p>
         </w:tc>
@@ -10596,7 +10575,6 @@
           </w:tcPr>
           <w:p>
             <w:pPr>
-              <w:pStyle w:val="affd"/>
               <w:spacing w:before="0" w:after="0" w:line="276" w:lineRule="auto"/>
               <w:jc w:val="center"/>
             </w:pPr>
@@ -10619,7 +10597,6 @@
           </w:tcPr>
           <w:p>
             <w:pPr>
-              <w:pStyle w:val="affd"/>
               <w:spacing w:before="0" w:after="0" w:line="276" w:lineRule="auto"/>
               <w:jc w:val="center"/>
             </w:pPr>
@@ -10642,7 +10619,6 @@
           </w:tcPr>
           <w:p>
             <w:pPr>
-              <w:pStyle w:val="affd"/>
               <w:spacing w:before="0" w:after="0" w:line="276" w:lineRule="auto"/>
               <w:jc w:val="center"/>
             </w:pPr>
@@ -10665,7 +10641,6 @@
           </w:tcPr>
           <w:p>
             <w:pPr>
-              <w:pStyle w:val="affd"/>
               <w:spacing w:before="0" w:after="0" w:line="276" w:lineRule="auto"/>
               <w:jc w:val="center"/>
             </w:pPr>
@@ -10688,7 +10663,6 @@
           </w:tcPr>
           <w:p>
             <w:pPr>
-              <w:pStyle w:val="affd"/>
               <w:spacing w:before="0" w:after="0" w:line="276" w:lineRule="auto"/>
               <w:jc w:val="center"/>
             </w:pPr>
@@ -10711,7 +10685,6 @@
           </w:tcPr>
           <w:p>
             <w:pPr>
-              <w:pStyle w:val="affd"/>
               <w:spacing w:before="0" w:after="0" w:line="276" w:lineRule="auto"/>
               <w:jc w:val="center"/>
             </w:pPr>
@@ -10734,7 +10707,6 @@
           </w:tcPr>
           <w:p>
             <w:pPr>
-              <w:pStyle w:val="affd"/>
               <w:spacing w:before="0" w:after="0" w:line="276" w:lineRule="auto"/>
               <w:jc w:val="center"/>
             </w:pPr>
@@ -10759,7 +10731,6 @@
           </w:tcPr>
           <w:p>
             <w:pPr>
-              <w:pStyle w:val="affd"/>
               <w:spacing w:before="0" w:after="0" w:line="276" w:lineRule="auto"/>
               <w:jc w:val="center"/>
             </w:pPr>
@@ -10782,7 +10753,6 @@
           </w:tcPr>
           <w:p>
             <w:pPr>
-              <w:pStyle w:val="affd"/>
               <w:spacing w:before="0" w:after="0" w:line="276" w:lineRule="auto"/>
               <w:jc w:val="center"/>
             </w:pPr>
@@ -10805,7 +10775,6 @@
           </w:tcPr>
           <w:p>
             <w:pPr>
-              <w:pStyle w:val="affd"/>
               <w:spacing w:before="0" w:after="0" w:line="276" w:lineRule="auto"/>
               <w:jc w:val="center"/>
             </w:pPr>
@@ -10828,7 +10797,6 @@
           </w:tcPr>
           <w:p>
             <w:pPr>
-              <w:pStyle w:val="affd"/>
               <w:spacing w:before="0" w:after="0" w:line="276" w:lineRule="auto"/>
               <w:jc w:val="center"/>
             </w:pPr>
@@ -10851,19 +10819,18 @@
           </w:tcPr>
           <w:p>
             <w:pPr>
-              <w:pStyle w:val="affd"/>
-              <w:spacing w:before="0" w:after="0" w:line="276" w:lineRule="auto"/>
-              <w:jc w:val="center"/>
-            </w:pPr>
-            <w:r/>
-            <w:r>
-              <w:rPr>
-                <w:rFonts w:ascii="Times New Roman" w:hAnsi="Times New Roman" w:eastAsia="KaiTi"/>
-                <w:b w:val="0"/>
-                <w:color w:val="000000"/>
-                <w:sz w:val="15"/>
-              </w:rPr>
-              <w:t>8.1%</w:t>
+              <w:spacing w:before="0" w:after="0" w:line="276" w:lineRule="auto"/>
+              <w:jc w:val="center"/>
+            </w:pPr>
+            <w:r/>
+            <w:r>
+              <w:rPr>
+                <w:rFonts w:ascii="Times New Roman" w:hAnsi="Times New Roman" w:eastAsia="KaiTi"/>
+                <w:b w:val="0"/>
+                <w:color w:val="000000"/>
+                <w:sz w:val="15"/>
+              </w:rPr>
+              <w:t>8.0%</w:t>
             </w:r>
           </w:p>
         </w:tc>
@@ -10874,7 +10841,6 @@
           </w:tcPr>
           <w:p>
             <w:pPr>
-              <w:pStyle w:val="affd"/>
               <w:spacing w:before="0" w:after="0" w:line="276" w:lineRule="auto"/>
               <w:jc w:val="center"/>
             </w:pPr>
@@ -10897,7 +10863,6 @@
           </w:tcPr>
           <w:p>
             <w:pPr>
-              <w:pStyle w:val="affd"/>
               <w:spacing w:before="0" w:after="0" w:line="276" w:lineRule="auto"/>
               <w:jc w:val="center"/>
             </w:pPr>
@@ -10922,7 +10887,6 @@
           </w:tcPr>
           <w:p>
             <w:pPr>
-              <w:pStyle w:val="affd"/>
               <w:spacing w:before="0" w:after="0" w:line="276" w:lineRule="auto"/>
               <w:jc w:val="center"/>
             </w:pPr>
@@ -10945,7 +10909,6 @@
           </w:tcPr>
           <w:p>
             <w:pPr>
-              <w:pStyle w:val="affd"/>
               <w:spacing w:before="0" w:after="0" w:line="276" w:lineRule="auto"/>
               <w:jc w:val="center"/>
             </w:pPr>
@@ -10968,7 +10931,6 @@
           </w:tcPr>
           <w:p>
             <w:pPr>
-              <w:pStyle w:val="affd"/>
               <w:spacing w:before="0" w:after="0" w:line="276" w:lineRule="auto"/>
               <w:jc w:val="center"/>
             </w:pPr>
@@ -10991,7 +10953,6 @@
           </w:tcPr>
           <w:p>
             <w:pPr>
-              <w:pStyle w:val="affd"/>
               <w:spacing w:before="0" w:after="0" w:line="276" w:lineRule="auto"/>
               <w:jc w:val="center"/>
             </w:pPr>
@@ -11014,7 +10975,6 @@
           </w:tcPr>
           <w:p>
             <w:pPr>
-              <w:pStyle w:val="affd"/>
               <w:spacing w:before="0" w:after="0" w:line="276" w:lineRule="auto"/>
               <w:jc w:val="center"/>
             </w:pPr>
@@ -11037,7 +10997,6 @@
           </w:tcPr>
           <w:p>
             <w:pPr>
-              <w:pStyle w:val="affd"/>
               <w:spacing w:before="0" w:after="0" w:line="276" w:lineRule="auto"/>
               <w:jc w:val="center"/>
             </w:pPr>
@@ -11060,7 +11019,6 @@
           </w:tcPr>
           <w:p>
             <w:pPr>
-              <w:pStyle w:val="affd"/>
               <w:spacing w:before="0" w:after="0" w:line="276" w:lineRule="auto"/>
               <w:jc w:val="center"/>
             </w:pPr>
@@ -11090,7 +11048,7 @@
           <w:color w:val="6B7280"/>
           <w:sz w:val="18"/>
         </w:rPr>
-        <w:t>资料来源：Morningstar、管理人产品资料、易方达产品研究。数据截至2026年5月31日，使用期权产品按二级复核后分类。</w:t>
+        <w:t>资料来源：Morningstar、管理人产品资料、易方达产品研究。数据截至2026年5月31日，使用期权产品按SecId唯一产品口径统计，并对同一品牌下不同注册实体做管理人名称归并。</w:t>
       </w:r>
     </w:p>
     <w:p>
@@ -11105,7 +11063,7 @@
           <w:color w:val="6B7280"/>
           <w:sz w:val="18"/>
         </w:rPr>
-        <w:t>注：AUM加权费率 = Σ（各产品费率×AUM）/ Σ（AUM），反映投资者实际承担的费率水平。全球使用期权ETF总AUM约3086.97亿美元。</w:t>
+        <w:t>注：AUM加权费率 = Σ（各产品费率×AUM）/ Σ（AUM），反映投资者实际承担的费率水平。全球使用期权ETF总AUM约3094.12亿美元。</w:t>
       </w:r>
     </w:p>
     <w:p>
@@ -11119,7 +11077,7 @@
           <w:color w:val="000000"/>
           <w:sz w:val="22"/>
         </w:rPr>
-        <w:t>从策略路径看，五家管理人呈现出三种差异化的定位：JPMorgan和NEOS以少数核心产品驱动规模——JPMorgan仅8只产品达到896亿美元，Top3产品AUM集中度达98.9%；NEOS仅8只产品达到249亿美元，Top3集中度96.9%。First Trust和Innovator则以产品矩阵的广度取胜——分别以142只和165只产品覆盖不同月份、缓冲深度和底层资产，Top3集中度仅为27.8%和15.9%。Global X作为最早布局covered call ETF的管理人（QYLD/XYLD均于2013年发行），虽拥有显著的先发时间窗口，但后续产品线扩张速度明显落后，33只产品仅贡献144亿美元AUM，且近1年出现资金净流出。</w:t>
+        <w:t>从策略路径看，五家管理人呈现出三种差异化的定位：JPMorgan和NEOS以少数核心产品驱动规模——JPMorgan仅9只产品达到897亿美元，Top3产品AUM集中度达98.9%；NEOS仅8只产品达到249亿美元，Top3集中度96.9%。First Trust和Innovator则以产品矩阵的广度取胜——分别以154只和165只产品覆盖不同月份、缓冲深度和底层资产，Top3集中度仅为27.8%和15.9%。Global X作为最早布局covered call ETF的管理人（QYLD/XYLD均于2013年发行），虽拥有显著的先发时间窗口，但后续产品线扩张速度明显落后，33只产品仅贡献144亿美元AUM，且近1年出现资金净流出。</w:t>
       </w:r>
     </w:p>
     <w:p>
@@ -11148,7 +11106,7 @@
           <w:color w:val="000000"/>
           <w:sz w:val="22"/>
         </w:rPr>
-        <w:t>JPMorgan在使用期权的衍生策略ETF中AUM约896.64亿美元，产品数量8只，覆盖收益增强5只、另类策略3只，AUM加权费率为0.36%。</w:t>
+        <w:t>JPMorgan在使用期权的衍生策略ETF中AUM约896.79亿美元，产品数量9只，覆盖收益增强5只、另类策略4只，AUM加权费率为0.36%。</w:t>
       </w:r>
     </w:p>
     <w:p>
@@ -11196,7 +11154,6 @@
           </w:tcPr>
           <w:p>
             <w:pPr>
-              <w:pStyle w:val="affd"/>
               <w:spacing w:before="0" w:after="0" w:line="276" w:lineRule="auto"/>
               <w:jc w:val="center"/>
             </w:pPr>
@@ -11220,7 +11177,6 @@
           </w:tcPr>
           <w:p>
             <w:pPr>
-              <w:pStyle w:val="affd"/>
               <w:spacing w:before="0" w:after="0" w:line="276" w:lineRule="auto"/>
               <w:jc w:val="center"/>
             </w:pPr>
@@ -11244,7 +11200,6 @@
           </w:tcPr>
           <w:p>
             <w:pPr>
-              <w:pStyle w:val="affd"/>
               <w:spacing w:before="0" w:after="0" w:line="276" w:lineRule="auto"/>
               <w:jc w:val="center"/>
             </w:pPr>
@@ -11268,7 +11223,6 @@
           </w:tcPr>
           <w:p>
             <w:pPr>
-              <w:pStyle w:val="affd"/>
               <w:spacing w:before="0" w:after="0" w:line="276" w:lineRule="auto"/>
               <w:jc w:val="center"/>
             </w:pPr>
@@ -11293,17 +11247,16 @@
           </w:tcPr>
           <w:p>
             <w:pPr>
-              <w:pStyle w:val="affd"/>
-              <w:spacing w:before="0" w:after="0" w:line="276" w:lineRule="auto"/>
-              <w:jc w:val="center"/>
-            </w:pPr>
-            <w:r/>
-            <w:r>
-              <w:rPr>
-                <w:rFonts w:ascii="Times New Roman" w:hAnsi="Times New Roman" w:eastAsia="KaiTi"/>
-                <w:b w:val="0"/>
-                <w:color w:val="000000"/>
-                <w:sz w:val="16"/>
+              <w:spacing w:before="0" w:after="0" w:line="276" w:lineRule="auto"/>
+              <w:jc w:val="center"/>
+            </w:pPr>
+            <w:r/>
+            <w:r>
+              <w:rPr>
+                <w:rFonts w:ascii="Times New Roman" w:hAnsi="Times New Roman" w:eastAsia="KaiTi"/>
+                <w:b w:val="0"/>
+                <w:color w:val="000000"/>
+                <w:sz w:val="15"/>
               </w:rPr>
               <w:t>2019</w:t>
             </w:r>
@@ -11316,17 +11269,16 @@
           </w:tcPr>
           <w:p>
             <w:pPr>
-              <w:pStyle w:val="affd"/>
-              <w:spacing w:before="0" w:after="0" w:line="276" w:lineRule="auto"/>
-              <w:jc w:val="center"/>
-            </w:pPr>
-            <w:r/>
-            <w:r>
-              <w:rPr>
-                <w:rFonts w:ascii="Times New Roman" w:hAnsi="Times New Roman" w:eastAsia="KaiTi"/>
-                <w:b w:val="0"/>
-                <w:color w:val="000000"/>
-                <w:sz w:val="16"/>
+              <w:spacing w:before="0" w:after="0" w:line="276" w:lineRule="auto"/>
+              <w:jc w:val="center"/>
+            </w:pPr>
+            <w:r/>
+            <w:r>
+              <w:rPr>
+                <w:rFonts w:ascii="Times New Roman" w:hAnsi="Times New Roman" w:eastAsia="KaiTi"/>
+                <w:b w:val="0"/>
+                <w:color w:val="000000"/>
+                <w:sz w:val="15"/>
               </w:rPr>
               <w:t>-</w:t>
             </w:r>
@@ -11339,17 +11291,16 @@
           </w:tcPr>
           <w:p>
             <w:pPr>
-              <w:pStyle w:val="affd"/>
-              <w:spacing w:before="0" w:after="0" w:line="276" w:lineRule="auto"/>
-              <w:jc w:val="center"/>
-            </w:pPr>
-            <w:r/>
-            <w:r>
-              <w:rPr>
-                <w:rFonts w:ascii="Times New Roman" w:hAnsi="Times New Roman" w:eastAsia="KaiTi"/>
-                <w:b w:val="0"/>
-                <w:color w:val="000000"/>
-                <w:sz w:val="16"/>
+              <w:spacing w:before="0" w:after="0" w:line="276" w:lineRule="auto"/>
+              <w:jc w:val="center"/>
+            </w:pPr>
+            <w:r/>
+            <w:r>
+              <w:rPr>
+                <w:rFonts w:ascii="Times New Roman" w:hAnsi="Times New Roman" w:eastAsia="KaiTi"/>
+                <w:b w:val="0"/>
+                <w:color w:val="000000"/>
+                <w:sz w:val="15"/>
               </w:rPr>
               <w:t>1</w:t>
             </w:r>
@@ -11362,17 +11313,16 @@
           </w:tcPr>
           <w:p>
             <w:pPr>
-              <w:pStyle w:val="affd"/>
-              <w:spacing w:before="0" w:after="0" w:line="276" w:lineRule="auto"/>
-              <w:jc w:val="center"/>
-            </w:pPr>
-            <w:r/>
-            <w:r>
-              <w:rPr>
-                <w:rFonts w:ascii="Times New Roman" w:hAnsi="Times New Roman" w:eastAsia="KaiTi"/>
-                <w:b w:val="0"/>
-                <w:color w:val="000000"/>
-                <w:sz w:val="16"/>
+              <w:spacing w:before="0" w:after="0" w:line="276" w:lineRule="auto"/>
+              <w:jc w:val="center"/>
+            </w:pPr>
+            <w:r/>
+            <w:r>
+              <w:rPr>
+                <w:rFonts w:ascii="Times New Roman" w:hAnsi="Times New Roman" w:eastAsia="KaiTi"/>
+                <w:b w:val="0"/>
+                <w:color w:val="000000"/>
+                <w:sz w:val="15"/>
               </w:rPr>
               <w:t>1</w:t>
             </w:r>
@@ -11387,17 +11337,16 @@
           </w:tcPr>
           <w:p>
             <w:pPr>
-              <w:pStyle w:val="affd"/>
-              <w:spacing w:before="0" w:after="0" w:line="276" w:lineRule="auto"/>
-              <w:jc w:val="center"/>
-            </w:pPr>
-            <w:r/>
-            <w:r>
-              <w:rPr>
-                <w:rFonts w:ascii="Times New Roman" w:hAnsi="Times New Roman" w:eastAsia="KaiTi"/>
-                <w:b w:val="0"/>
-                <w:color w:val="000000"/>
-                <w:sz w:val="16"/>
+              <w:spacing w:before="0" w:after="0" w:line="276" w:lineRule="auto"/>
+              <w:jc w:val="center"/>
+            </w:pPr>
+            <w:r/>
+            <w:r>
+              <w:rPr>
+                <w:rFonts w:ascii="Times New Roman" w:hAnsi="Times New Roman" w:eastAsia="KaiTi"/>
+                <w:b w:val="0"/>
+                <w:color w:val="000000"/>
+                <w:sz w:val="15"/>
               </w:rPr>
               <w:t>2020</w:t>
             </w:r>
@@ -11410,17 +11359,16 @@
           </w:tcPr>
           <w:p>
             <w:pPr>
-              <w:pStyle w:val="affd"/>
-              <w:spacing w:before="0" w:after="0" w:line="276" w:lineRule="auto"/>
-              <w:jc w:val="center"/>
-            </w:pPr>
-            <w:r/>
-            <w:r>
-              <w:rPr>
-                <w:rFonts w:ascii="Times New Roman" w:hAnsi="Times New Roman" w:eastAsia="KaiTi"/>
-                <w:b w:val="0"/>
-                <w:color w:val="000000"/>
-                <w:sz w:val="16"/>
+              <w:spacing w:before="0" w:after="0" w:line="276" w:lineRule="auto"/>
+              <w:jc w:val="center"/>
+            </w:pPr>
+            <w:r/>
+            <w:r>
+              <w:rPr>
+                <w:rFonts w:ascii="Times New Roman" w:hAnsi="Times New Roman" w:eastAsia="KaiTi"/>
+                <w:b w:val="0"/>
+                <w:color w:val="000000"/>
+                <w:sz w:val="15"/>
               </w:rPr>
               <w:t>1</w:t>
             </w:r>
@@ -11433,17 +11381,16 @@
           </w:tcPr>
           <w:p>
             <w:pPr>
-              <w:pStyle w:val="affd"/>
-              <w:spacing w:before="0" w:after="0" w:line="276" w:lineRule="auto"/>
-              <w:jc w:val="center"/>
-            </w:pPr>
-            <w:r/>
-            <w:r>
-              <w:rPr>
-                <w:rFonts w:ascii="Times New Roman" w:hAnsi="Times New Roman" w:eastAsia="KaiTi"/>
-                <w:b w:val="0"/>
-                <w:color w:val="000000"/>
-                <w:sz w:val="16"/>
+              <w:spacing w:before="0" w:after="0" w:line="276" w:lineRule="auto"/>
+              <w:jc w:val="center"/>
+            </w:pPr>
+            <w:r/>
+            <w:r>
+              <w:rPr>
+                <w:rFonts w:ascii="Times New Roman" w:hAnsi="Times New Roman" w:eastAsia="KaiTi"/>
+                <w:b w:val="0"/>
+                <w:color w:val="000000"/>
+                <w:sz w:val="15"/>
               </w:rPr>
               <w:t>-</w:t>
             </w:r>
@@ -11456,17 +11403,16 @@
           </w:tcPr>
           <w:p>
             <w:pPr>
-              <w:pStyle w:val="affd"/>
-              <w:spacing w:before="0" w:after="0" w:line="276" w:lineRule="auto"/>
-              <w:jc w:val="center"/>
-            </w:pPr>
-            <w:r/>
-            <w:r>
-              <w:rPr>
-                <w:rFonts w:ascii="Times New Roman" w:hAnsi="Times New Roman" w:eastAsia="KaiTi"/>
-                <w:b w:val="0"/>
-                <w:color w:val="000000"/>
-                <w:sz w:val="16"/>
+              <w:spacing w:before="0" w:after="0" w:line="276" w:lineRule="auto"/>
+              <w:jc w:val="center"/>
+            </w:pPr>
+            <w:r/>
+            <w:r>
+              <w:rPr>
+                <w:rFonts w:ascii="Times New Roman" w:hAnsi="Times New Roman" w:eastAsia="KaiTi"/>
+                <w:b w:val="0"/>
+                <w:color w:val="000000"/>
+                <w:sz w:val="15"/>
               </w:rPr>
               <w:t>1</w:t>
             </w:r>
@@ -11481,17 +11427,16 @@
           </w:tcPr>
           <w:p>
             <w:pPr>
-              <w:pStyle w:val="affd"/>
-              <w:spacing w:before="0" w:after="0" w:line="276" w:lineRule="auto"/>
-              <w:jc w:val="center"/>
-            </w:pPr>
-            <w:r/>
-            <w:r>
-              <w:rPr>
-                <w:rFonts w:ascii="Times New Roman" w:hAnsi="Times New Roman" w:eastAsia="KaiTi"/>
-                <w:b w:val="0"/>
-                <w:color w:val="000000"/>
-                <w:sz w:val="16"/>
+              <w:spacing w:before="0" w:after="0" w:line="276" w:lineRule="auto"/>
+              <w:jc w:val="center"/>
+            </w:pPr>
+            <w:r/>
+            <w:r>
+              <w:rPr>
+                <w:rFonts w:ascii="Times New Roman" w:hAnsi="Times New Roman" w:eastAsia="KaiTi"/>
+                <w:b w:val="0"/>
+                <w:color w:val="000000"/>
+                <w:sz w:val="15"/>
               </w:rPr>
               <w:t>2022</w:t>
             </w:r>
@@ -11504,17 +11449,16 @@
           </w:tcPr>
           <w:p>
             <w:pPr>
-              <w:pStyle w:val="affd"/>
-              <w:spacing w:before="0" w:after="0" w:line="276" w:lineRule="auto"/>
-              <w:jc w:val="center"/>
-            </w:pPr>
-            <w:r/>
-            <w:r>
-              <w:rPr>
-                <w:rFonts w:ascii="Times New Roman" w:hAnsi="Times New Roman" w:eastAsia="KaiTi"/>
-                <w:b w:val="0"/>
-                <w:color w:val="000000"/>
-                <w:sz w:val="16"/>
+              <w:spacing w:before="0" w:after="0" w:line="276" w:lineRule="auto"/>
+              <w:jc w:val="center"/>
+            </w:pPr>
+            <w:r/>
+            <w:r>
+              <w:rPr>
+                <w:rFonts w:ascii="Times New Roman" w:hAnsi="Times New Roman" w:eastAsia="KaiTi"/>
+                <w:b w:val="0"/>
+                <w:color w:val="000000"/>
+                <w:sz w:val="15"/>
               </w:rPr>
               <w:t>1</w:t>
             </w:r>
@@ -11527,17 +11471,16 @@
           </w:tcPr>
           <w:p>
             <w:pPr>
-              <w:pStyle w:val="affd"/>
-              <w:spacing w:before="0" w:after="0" w:line="276" w:lineRule="auto"/>
-              <w:jc w:val="center"/>
-            </w:pPr>
-            <w:r/>
-            <w:r>
-              <w:rPr>
-                <w:rFonts w:ascii="Times New Roman" w:hAnsi="Times New Roman" w:eastAsia="KaiTi"/>
-                <w:b w:val="0"/>
-                <w:color w:val="000000"/>
-                <w:sz w:val="16"/>
+              <w:spacing w:before="0" w:after="0" w:line="276" w:lineRule="auto"/>
+              <w:jc w:val="center"/>
+            </w:pPr>
+            <w:r/>
+            <w:r>
+              <w:rPr>
+                <w:rFonts w:ascii="Times New Roman" w:hAnsi="Times New Roman" w:eastAsia="KaiTi"/>
+                <w:b w:val="0"/>
+                <w:color w:val="000000"/>
+                <w:sz w:val="15"/>
               </w:rPr>
               <w:t>-</w:t>
             </w:r>
@@ -11550,17 +11493,16 @@
           </w:tcPr>
           <w:p>
             <w:pPr>
-              <w:pStyle w:val="affd"/>
-              <w:spacing w:before="0" w:after="0" w:line="276" w:lineRule="auto"/>
-              <w:jc w:val="center"/>
-            </w:pPr>
-            <w:r/>
-            <w:r>
-              <w:rPr>
-                <w:rFonts w:ascii="Times New Roman" w:hAnsi="Times New Roman" w:eastAsia="KaiTi"/>
-                <w:b w:val="0"/>
-                <w:color w:val="000000"/>
-                <w:sz w:val="16"/>
+              <w:spacing w:before="0" w:after="0" w:line="276" w:lineRule="auto"/>
+              <w:jc w:val="center"/>
+            </w:pPr>
+            <w:r/>
+            <w:r>
+              <w:rPr>
+                <w:rFonts w:ascii="Times New Roman" w:hAnsi="Times New Roman" w:eastAsia="KaiTi"/>
+                <w:b w:val="0"/>
+                <w:color w:val="000000"/>
+                <w:sz w:val="15"/>
               </w:rPr>
               <w:t>1</w:t>
             </w:r>
@@ -11575,17 +11517,16 @@
           </w:tcPr>
           <w:p>
             <w:pPr>
-              <w:pStyle w:val="affd"/>
-              <w:spacing w:before="0" w:after="0" w:line="276" w:lineRule="auto"/>
-              <w:jc w:val="center"/>
-            </w:pPr>
-            <w:r/>
-            <w:r>
-              <w:rPr>
-                <w:rFonts w:ascii="Times New Roman" w:hAnsi="Times New Roman" w:eastAsia="KaiTi"/>
-                <w:b w:val="0"/>
-                <w:color w:val="000000"/>
-                <w:sz w:val="16"/>
+              <w:spacing w:before="0" w:after="0" w:line="276" w:lineRule="auto"/>
+              <w:jc w:val="center"/>
+            </w:pPr>
+            <w:r/>
+            <w:r>
+              <w:rPr>
+                <w:rFonts w:ascii="Times New Roman" w:hAnsi="Times New Roman" w:eastAsia="KaiTi"/>
+                <w:b w:val="0"/>
+                <w:color w:val="000000"/>
+                <w:sz w:val="15"/>
               </w:rPr>
               <w:t>2023</w:t>
             </w:r>
@@ -11598,17 +11539,16 @@
           </w:tcPr>
           <w:p>
             <w:pPr>
-              <w:pStyle w:val="affd"/>
-              <w:spacing w:before="0" w:after="0" w:line="276" w:lineRule="auto"/>
-              <w:jc w:val="center"/>
-            </w:pPr>
-            <w:r/>
-            <w:r>
-              <w:rPr>
-                <w:rFonts w:ascii="Times New Roman" w:hAnsi="Times New Roman" w:eastAsia="KaiTi"/>
-                <w:b w:val="0"/>
-                <w:color w:val="000000"/>
-                <w:sz w:val="16"/>
+              <w:spacing w:before="0" w:after="0" w:line="276" w:lineRule="auto"/>
+              <w:jc w:val="center"/>
+            </w:pPr>
+            <w:r/>
+            <w:r>
+              <w:rPr>
+                <w:rFonts w:ascii="Times New Roman" w:hAnsi="Times New Roman" w:eastAsia="KaiTi"/>
+                <w:b w:val="0"/>
+                <w:color w:val="000000"/>
+                <w:sz w:val="15"/>
               </w:rPr>
               <w:t>-</w:t>
             </w:r>
@@ -11621,17 +11561,16 @@
           </w:tcPr>
           <w:p>
             <w:pPr>
-              <w:pStyle w:val="affd"/>
-              <w:spacing w:before="0" w:after="0" w:line="276" w:lineRule="auto"/>
-              <w:jc w:val="center"/>
-            </w:pPr>
-            <w:r/>
-            <w:r>
-              <w:rPr>
-                <w:rFonts w:ascii="Times New Roman" w:hAnsi="Times New Roman" w:eastAsia="KaiTi"/>
-                <w:b w:val="0"/>
-                <w:color w:val="000000"/>
-                <w:sz w:val="16"/>
+              <w:spacing w:before="0" w:after="0" w:line="276" w:lineRule="auto"/>
+              <w:jc w:val="center"/>
+            </w:pPr>
+            <w:r/>
+            <w:r>
+              <w:rPr>
+                <w:rFonts w:ascii="Times New Roman" w:hAnsi="Times New Roman" w:eastAsia="KaiTi"/>
+                <w:b w:val="0"/>
+                <w:color w:val="000000"/>
+                <w:sz w:val="15"/>
               </w:rPr>
               <w:t>1</w:t>
             </w:r>
@@ -11644,17 +11583,16 @@
           </w:tcPr>
           <w:p>
             <w:pPr>
-              <w:pStyle w:val="affd"/>
-              <w:spacing w:before="0" w:after="0" w:line="276" w:lineRule="auto"/>
-              <w:jc w:val="center"/>
-            </w:pPr>
-            <w:r/>
-            <w:r>
-              <w:rPr>
-                <w:rFonts w:ascii="Times New Roman" w:hAnsi="Times New Roman" w:eastAsia="KaiTi"/>
-                <w:b w:val="0"/>
-                <w:color w:val="000000"/>
-                <w:sz w:val="16"/>
+              <w:spacing w:before="0" w:after="0" w:line="276" w:lineRule="auto"/>
+              <w:jc w:val="center"/>
+            </w:pPr>
+            <w:r/>
+            <w:r>
+              <w:rPr>
+                <w:rFonts w:ascii="Times New Roman" w:hAnsi="Times New Roman" w:eastAsia="KaiTi"/>
+                <w:b w:val="0"/>
+                <w:color w:val="000000"/>
+                <w:sz w:val="15"/>
               </w:rPr>
               <w:t>1</w:t>
             </w:r>
@@ -11669,17 +11607,16 @@
           </w:tcPr>
           <w:p>
             <w:pPr>
-              <w:pStyle w:val="affd"/>
-              <w:spacing w:before="0" w:after="0" w:line="276" w:lineRule="auto"/>
-              <w:jc w:val="center"/>
-            </w:pPr>
-            <w:r/>
-            <w:r>
-              <w:rPr>
-                <w:rFonts w:ascii="Times New Roman" w:hAnsi="Times New Roman" w:eastAsia="KaiTi"/>
-                <w:b w:val="0"/>
-                <w:color w:val="000000"/>
-                <w:sz w:val="16"/>
+              <w:spacing w:before="0" w:after="0" w:line="276" w:lineRule="auto"/>
+              <w:jc w:val="center"/>
+            </w:pPr>
+            <w:r/>
+            <w:r>
+              <w:rPr>
+                <w:rFonts w:ascii="Times New Roman" w:hAnsi="Times New Roman" w:eastAsia="KaiTi"/>
+                <w:b w:val="0"/>
+                <w:color w:val="000000"/>
+                <w:sz w:val="15"/>
               </w:rPr>
               <w:t>2025</w:t>
             </w:r>
@@ -11692,17 +11629,16 @@
           </w:tcPr>
           <w:p>
             <w:pPr>
-              <w:pStyle w:val="affd"/>
-              <w:spacing w:before="0" w:after="0" w:line="276" w:lineRule="auto"/>
-              <w:jc w:val="center"/>
-            </w:pPr>
-            <w:r/>
-            <w:r>
-              <w:rPr>
-                <w:rFonts w:ascii="Times New Roman" w:hAnsi="Times New Roman" w:eastAsia="KaiTi"/>
-                <w:b w:val="0"/>
-                <w:color w:val="000000"/>
-                <w:sz w:val="16"/>
+              <w:spacing w:before="0" w:after="0" w:line="276" w:lineRule="auto"/>
+              <w:jc w:val="center"/>
+            </w:pPr>
+            <w:r/>
+            <w:r>
+              <w:rPr>
+                <w:rFonts w:ascii="Times New Roman" w:hAnsi="Times New Roman" w:eastAsia="KaiTi"/>
+                <w:b w:val="0"/>
+                <w:color w:val="000000"/>
+                <w:sz w:val="15"/>
               </w:rPr>
               <w:t>1</w:t>
             </w:r>
@@ -11715,19 +11651,18 @@
           </w:tcPr>
           <w:p>
             <w:pPr>
-              <w:pStyle w:val="affd"/>
-              <w:spacing w:before="0" w:after="0" w:line="276" w:lineRule="auto"/>
-              <w:jc w:val="center"/>
-            </w:pPr>
-            <w:r/>
-            <w:r>
-              <w:rPr>
-                <w:rFonts w:ascii="Times New Roman" w:hAnsi="Times New Roman" w:eastAsia="KaiTi"/>
-                <w:b w:val="0"/>
-                <w:color w:val="000000"/>
-                <w:sz w:val="16"/>
-              </w:rPr>
-              <w:t>1</w:t>
+              <w:spacing w:before="0" w:after="0" w:line="276" w:lineRule="auto"/>
+              <w:jc w:val="center"/>
+            </w:pPr>
+            <w:r/>
+            <w:r>
+              <w:rPr>
+                <w:rFonts w:ascii="Times New Roman" w:hAnsi="Times New Roman" w:eastAsia="KaiTi"/>
+                <w:b w:val="0"/>
+                <w:color w:val="000000"/>
+                <w:sz w:val="15"/>
+              </w:rPr>
+              <w:t>2</w:t>
             </w:r>
           </w:p>
         </w:tc>
@@ -11738,19 +11673,18 @@
           </w:tcPr>
           <w:p>
             <w:pPr>
-              <w:pStyle w:val="affd"/>
-              <w:spacing w:before="0" w:after="0" w:line="276" w:lineRule="auto"/>
-              <w:jc w:val="center"/>
-            </w:pPr>
-            <w:r/>
-            <w:r>
-              <w:rPr>
-                <w:rFonts w:ascii="Times New Roman" w:hAnsi="Times New Roman" w:eastAsia="KaiTi"/>
-                <w:b w:val="0"/>
-                <w:color w:val="000000"/>
-                <w:sz w:val="16"/>
-              </w:rPr>
-              <w:t>2</w:t>
+              <w:spacing w:before="0" w:after="0" w:line="276" w:lineRule="auto"/>
+              <w:jc w:val="center"/>
+            </w:pPr>
+            <w:r/>
+            <w:r>
+              <w:rPr>
+                <w:rFonts w:ascii="Times New Roman" w:hAnsi="Times New Roman" w:eastAsia="KaiTi"/>
+                <w:b w:val="0"/>
+                <w:color w:val="000000"/>
+                <w:sz w:val="15"/>
+              </w:rPr>
+              <w:t>3</w:t>
             </w:r>
           </w:p>
         </w:tc>
@@ -11763,17 +11697,16 @@
           </w:tcPr>
           <w:p>
             <w:pPr>
-              <w:pStyle w:val="affd"/>
-              <w:spacing w:before="0" w:after="0" w:line="276" w:lineRule="auto"/>
-              <w:jc w:val="center"/>
-            </w:pPr>
-            <w:r/>
-            <w:r>
-              <w:rPr>
-                <w:rFonts w:ascii="Times New Roman" w:hAnsi="Times New Roman" w:eastAsia="KaiTi"/>
-                <w:b w:val="0"/>
-                <w:color w:val="000000"/>
-                <w:sz w:val="16"/>
+              <w:spacing w:before="0" w:after="0" w:line="276" w:lineRule="auto"/>
+              <w:jc w:val="center"/>
+            </w:pPr>
+            <w:r/>
+            <w:r>
+              <w:rPr>
+                <w:rFonts w:ascii="Times New Roman" w:hAnsi="Times New Roman" w:eastAsia="KaiTi"/>
+                <w:b w:val="0"/>
+                <w:color w:val="000000"/>
+                <w:sz w:val="15"/>
               </w:rPr>
               <w:t>2026</w:t>
             </w:r>
@@ -11786,17 +11719,16 @@
           </w:tcPr>
           <w:p>
             <w:pPr>
-              <w:pStyle w:val="affd"/>
-              <w:spacing w:before="0" w:after="0" w:line="276" w:lineRule="auto"/>
-              <w:jc w:val="center"/>
-            </w:pPr>
-            <w:r/>
-            <w:r>
-              <w:rPr>
-                <w:rFonts w:ascii="Times New Roman" w:hAnsi="Times New Roman" w:eastAsia="KaiTi"/>
-                <w:b w:val="0"/>
-                <w:color w:val="000000"/>
-                <w:sz w:val="16"/>
+              <w:spacing w:before="0" w:after="0" w:line="276" w:lineRule="auto"/>
+              <w:jc w:val="center"/>
+            </w:pPr>
+            <w:r/>
+            <w:r>
+              <w:rPr>
+                <w:rFonts w:ascii="Times New Roman" w:hAnsi="Times New Roman" w:eastAsia="KaiTi"/>
+                <w:b w:val="0"/>
+                <w:color w:val="000000"/>
+                <w:sz w:val="15"/>
               </w:rPr>
               <w:t>2</w:t>
             </w:r>
@@ -11809,17 +11741,16 @@
           </w:tcPr>
           <w:p>
             <w:pPr>
-              <w:pStyle w:val="affd"/>
-              <w:spacing w:before="0" w:after="0" w:line="276" w:lineRule="auto"/>
-              <w:jc w:val="center"/>
-            </w:pPr>
-            <w:r/>
-            <w:r>
-              <w:rPr>
-                <w:rFonts w:ascii="Times New Roman" w:hAnsi="Times New Roman" w:eastAsia="KaiTi"/>
-                <w:b w:val="0"/>
-                <w:color w:val="000000"/>
-                <w:sz w:val="16"/>
+              <w:spacing w:before="0" w:after="0" w:line="276" w:lineRule="auto"/>
+              <w:jc w:val="center"/>
+            </w:pPr>
+            <w:r/>
+            <w:r>
+              <w:rPr>
+                <w:rFonts w:ascii="Times New Roman" w:hAnsi="Times New Roman" w:eastAsia="KaiTi"/>
+                <w:b w:val="0"/>
+                <w:color w:val="000000"/>
+                <w:sz w:val="15"/>
               </w:rPr>
               <w:t>-</w:t>
             </w:r>
@@ -11832,17 +11763,16 @@
           </w:tcPr>
           <w:p>
             <w:pPr>
-              <w:pStyle w:val="affd"/>
-              <w:spacing w:before="0" w:after="0" w:line="276" w:lineRule="auto"/>
-              <w:jc w:val="center"/>
-            </w:pPr>
-            <w:r/>
-            <w:r>
-              <w:rPr>
-                <w:rFonts w:ascii="Times New Roman" w:hAnsi="Times New Roman" w:eastAsia="KaiTi"/>
-                <w:b w:val="0"/>
-                <w:color w:val="000000"/>
-                <w:sz w:val="16"/>
+              <w:spacing w:before="0" w:after="0" w:line="276" w:lineRule="auto"/>
+              <w:jc w:val="center"/>
+            </w:pPr>
+            <w:r/>
+            <w:r>
+              <w:rPr>
+                <w:rFonts w:ascii="Times New Roman" w:hAnsi="Times New Roman" w:eastAsia="KaiTi"/>
+                <w:b w:val="0"/>
+                <w:color w:val="000000"/>
+                <w:sz w:val="15"/>
               </w:rPr>
               <w:t>2</w:t>
             </w:r>
@@ -11876,7 +11806,7 @@
           <w:color w:val="000000"/>
           <w:sz w:val="22"/>
         </w:rPr>
-        <w:t>从发行节奏看，2019-2020年为早期布局阶段，共发行2只产品，以收益增强1只、另类策略1只为主；2022-2023年为集中扩张阶段，共发行2只，以收益增强1只、另类策略1只为主；2025-2026年发行4只，以收益增强3只、另类策略1只为主。其策略不在于产品数量多，而在于JEPI和JEPQ两只核心产品各自达到400亿美元以上的规模。</w:t>
+        <w:t>从发行节奏看，2019-2020年为早期布局阶段，共发行2只产品，以收益增强1只、另类策略1只为主；2022-2023年为集中扩张阶段，共发行2只，以收益增强1只、另类策略1只为主；2025-2026年发行5只，以收益增强3只、另类策略2只为主。其策略不在于产品数量多，而在于JEPI和JEPQ两只核心产品各自达到400亿美元以上的规模。</w:t>
       </w:r>
     </w:p>
     <w:p>
@@ -11925,7 +11855,6 @@
           </w:tcPr>
           <w:p>
             <w:pPr>
-              <w:pStyle w:val="affd"/>
               <w:spacing w:before="0" w:after="0" w:line="276" w:lineRule="auto"/>
               <w:jc w:val="center"/>
             </w:pPr>
@@ -11949,7 +11878,6 @@
           </w:tcPr>
           <w:p>
             <w:pPr>
-              <w:pStyle w:val="affd"/>
               <w:spacing w:before="0" w:after="0" w:line="276" w:lineRule="auto"/>
               <w:jc w:val="center"/>
             </w:pPr>
@@ -11973,7 +11901,6 @@
           </w:tcPr>
           <w:p>
             <w:pPr>
-              <w:pStyle w:val="affd"/>
               <w:spacing w:before="0" w:after="0" w:line="276" w:lineRule="auto"/>
               <w:jc w:val="center"/>
             </w:pPr>
@@ -11997,7 +11924,6 @@
           </w:tcPr>
           <w:p>
             <w:pPr>
-              <w:pStyle w:val="affd"/>
               <w:spacing w:before="0" w:after="0" w:line="276" w:lineRule="auto"/>
               <w:jc w:val="center"/>
             </w:pPr>
@@ -12021,7 +11947,6 @@
           </w:tcPr>
           <w:p>
             <w:pPr>
-              <w:pStyle w:val="affd"/>
               <w:spacing w:before="0" w:after="0" w:line="276" w:lineRule="auto"/>
               <w:jc w:val="center"/>
             </w:pPr>
@@ -12046,7 +11971,6 @@
           </w:tcPr>
           <w:p>
             <w:pPr>
-              <w:pStyle w:val="affd"/>
               <w:spacing w:before="0" w:after="0" w:line="276" w:lineRule="auto"/>
               <w:jc w:val="center"/>
             </w:pPr>
@@ -12069,7 +11993,6 @@
           </w:tcPr>
           <w:p>
             <w:pPr>
-              <w:pStyle w:val="affd"/>
               <w:spacing w:before="0" w:after="0" w:line="276" w:lineRule="auto"/>
               <w:jc w:val="center"/>
             </w:pPr>
@@ -12092,19 +12015,18 @@
           </w:tcPr>
           <w:p>
             <w:pPr>
-              <w:pStyle w:val="affd"/>
-              <w:spacing w:before="0" w:after="0" w:line="276" w:lineRule="auto"/>
-              <w:jc w:val="center"/>
-            </w:pPr>
-            <w:r/>
-            <w:r>
-              <w:rPr>
-                <w:rFonts w:ascii="Times New Roman" w:hAnsi="Times New Roman" w:eastAsia="KaiTi"/>
-                <w:b w:val="0"/>
-                <w:color w:val="000000"/>
-                <w:sz w:val="15"/>
-              </w:rPr>
-              <w:t>流入8只/流出0只</w:t>
+              <w:spacing w:before="0" w:after="0" w:line="276" w:lineRule="auto"/>
+              <w:jc w:val="center"/>
+            </w:pPr>
+            <w:r/>
+            <w:r>
+              <w:rPr>
+                <w:rFonts w:ascii="Times New Roman" w:hAnsi="Times New Roman" w:eastAsia="KaiTi"/>
+                <w:b w:val="0"/>
+                <w:color w:val="000000"/>
+                <w:sz w:val="15"/>
+              </w:rPr>
+              <w:t>流入8只/流出1只</w:t>
             </w:r>
           </w:p>
         </w:tc>
@@ -12115,19 +12037,18 @@
           </w:tcPr>
           <w:p>
             <w:pPr>
-              <w:pStyle w:val="affd"/>
-              <w:spacing w:before="0" w:after="0" w:line="276" w:lineRule="auto"/>
-              <w:jc w:val="center"/>
-            </w:pPr>
-            <w:r/>
-            <w:r>
-              <w:rPr>
-                <w:rFonts w:ascii="Times New Roman" w:hAnsi="Times New Roman" w:eastAsia="KaiTi"/>
-                <w:b w:val="0"/>
-                <w:color w:val="000000"/>
-                <w:sz w:val="15"/>
-              </w:rPr>
-              <w:t>流入合计+14.17亿 / 流出合计0.00亿</w:t>
+              <w:spacing w:before="0" w:after="0" w:line="276" w:lineRule="auto"/>
+              <w:jc w:val="center"/>
+            </w:pPr>
+            <w:r/>
+            <w:r>
+              <w:rPr>
+                <w:rFonts w:ascii="Times New Roman" w:hAnsi="Times New Roman" w:eastAsia="KaiTi"/>
+                <w:b w:val="0"/>
+                <w:color w:val="000000"/>
+                <w:sz w:val="15"/>
+              </w:rPr>
+              <w:t>流入合计+14.17亿 / 流出合计-0.00亿</w:t>
             </w:r>
           </w:p>
         </w:tc>
@@ -12138,7 +12059,6 @@
           </w:tcPr>
           <w:p>
             <w:pPr>
-              <w:pStyle w:val="affd"/>
               <w:spacing w:before="0" w:after="0" w:line="276" w:lineRule="auto"/>
               <w:jc w:val="center"/>
             </w:pPr>
@@ -12163,7 +12083,6 @@
           </w:tcPr>
           <w:p>
             <w:pPr>
-              <w:pStyle w:val="affd"/>
               <w:spacing w:before="0" w:after="0" w:line="276" w:lineRule="auto"/>
               <w:jc w:val="center"/>
             </w:pPr>
@@ -12186,19 +12105,18 @@
           </w:tcPr>
           <w:p>
             <w:pPr>
-              <w:pStyle w:val="affd"/>
-              <w:spacing w:before="0" w:after="0" w:line="276" w:lineRule="auto"/>
-              <w:jc w:val="center"/>
-            </w:pPr>
-            <w:r/>
-            <w:r>
-              <w:rPr>
-                <w:rFonts w:ascii="Times New Roman" w:hAnsi="Times New Roman" w:eastAsia="KaiTi"/>
-                <w:b w:val="0"/>
-                <w:color w:val="000000"/>
-                <w:sz w:val="15"/>
-              </w:rPr>
-              <w:t>+61.91</w:t>
+              <w:spacing w:before="0" w:after="0" w:line="276" w:lineRule="auto"/>
+              <w:jc w:val="center"/>
+            </w:pPr>
+            <w:r/>
+            <w:r>
+              <w:rPr>
+                <w:rFonts w:ascii="Times New Roman" w:hAnsi="Times New Roman" w:eastAsia="KaiTi"/>
+                <w:b w:val="0"/>
+                <w:color w:val="000000"/>
+                <w:sz w:val="15"/>
+              </w:rPr>
+              <w:t>+61.92</w:t>
             </w:r>
           </w:p>
         </w:tc>
@@ -12209,19 +12127,18 @@
           </w:tcPr>
           <w:p>
             <w:pPr>
-              <w:pStyle w:val="affd"/>
-              <w:spacing w:before="0" w:after="0" w:line="276" w:lineRule="auto"/>
-              <w:jc w:val="center"/>
-            </w:pPr>
-            <w:r/>
-            <w:r>
-              <w:rPr>
-                <w:rFonts w:ascii="Times New Roman" w:hAnsi="Times New Roman" w:eastAsia="KaiTi"/>
-                <w:b w:val="0"/>
-                <w:color w:val="000000"/>
-                <w:sz w:val="15"/>
-              </w:rPr>
-              <w:t>流入8只/流出0只</w:t>
+              <w:spacing w:before="0" w:after="0" w:line="276" w:lineRule="auto"/>
+              <w:jc w:val="center"/>
+            </w:pPr>
+            <w:r/>
+            <w:r>
+              <w:rPr>
+                <w:rFonts w:ascii="Times New Roman" w:hAnsi="Times New Roman" w:eastAsia="KaiTi"/>
+                <w:b w:val="0"/>
+                <w:color w:val="000000"/>
+                <w:sz w:val="15"/>
+              </w:rPr>
+              <w:t>流入9只/流出0只</w:t>
             </w:r>
           </w:p>
         </w:tc>
@@ -12232,19 +12149,18 @@
           </w:tcPr>
           <w:p>
             <w:pPr>
-              <w:pStyle w:val="affd"/>
-              <w:spacing w:before="0" w:after="0" w:line="276" w:lineRule="auto"/>
-              <w:jc w:val="center"/>
-            </w:pPr>
-            <w:r/>
-            <w:r>
-              <w:rPr>
-                <w:rFonts w:ascii="Times New Roman" w:hAnsi="Times New Roman" w:eastAsia="KaiTi"/>
-                <w:b w:val="0"/>
-                <w:color w:val="000000"/>
-                <w:sz w:val="15"/>
-              </w:rPr>
-              <w:t>流入合计+61.91亿 / 流出合计0.00亿</w:t>
+              <w:spacing w:before="0" w:after="0" w:line="276" w:lineRule="auto"/>
+              <w:jc w:val="center"/>
+            </w:pPr>
+            <w:r/>
+            <w:r>
+              <w:rPr>
+                <w:rFonts w:ascii="Times New Roman" w:hAnsi="Times New Roman" w:eastAsia="KaiTi"/>
+                <w:b w:val="0"/>
+                <w:color w:val="000000"/>
+                <w:sz w:val="15"/>
+              </w:rPr>
+              <w:t>流入合计+61.92亿 / 流出合计0.00亿</w:t>
             </w:r>
           </w:p>
         </w:tc>
@@ -12255,7 +12171,6 @@
           </w:tcPr>
           <w:p>
             <w:pPr>
-              <w:pStyle w:val="affd"/>
               <w:spacing w:before="0" w:after="0" w:line="276" w:lineRule="auto"/>
               <w:jc w:val="center"/>
             </w:pPr>
@@ -12280,7 +12195,6 @@
           </w:tcPr>
           <w:p>
             <w:pPr>
-              <w:pStyle w:val="affd"/>
               <w:spacing w:before="0" w:after="0" w:line="276" w:lineRule="auto"/>
               <w:jc w:val="center"/>
             </w:pPr>
@@ -12303,19 +12217,18 @@
           </w:tcPr>
           <w:p>
             <w:pPr>
-              <w:pStyle w:val="affd"/>
-              <w:spacing w:before="0" w:after="0" w:line="276" w:lineRule="auto"/>
-              <w:jc w:val="center"/>
-            </w:pPr>
-            <w:r/>
-            <w:r>
-              <w:rPr>
-                <w:rFonts w:ascii="Times New Roman" w:hAnsi="Times New Roman" w:eastAsia="KaiTi"/>
-                <w:b w:val="0"/>
-                <w:color w:val="000000"/>
-                <w:sz w:val="15"/>
-              </w:rPr>
-              <w:t>+114.77</w:t>
+              <w:spacing w:before="0" w:after="0" w:line="276" w:lineRule="auto"/>
+              <w:jc w:val="center"/>
+            </w:pPr>
+            <w:r/>
+            <w:r>
+              <w:rPr>
+                <w:rFonts w:ascii="Times New Roman" w:hAnsi="Times New Roman" w:eastAsia="KaiTi"/>
+                <w:b w:val="0"/>
+                <w:color w:val="000000"/>
+                <w:sz w:val="15"/>
+              </w:rPr>
+              <w:t>+114.81</w:t>
             </w:r>
           </w:p>
         </w:tc>
@@ -12326,19 +12239,18 @@
           </w:tcPr>
           <w:p>
             <w:pPr>
-              <w:pStyle w:val="affd"/>
-              <w:spacing w:before="0" w:after="0" w:line="276" w:lineRule="auto"/>
-              <w:jc w:val="center"/>
-            </w:pPr>
-            <w:r/>
-            <w:r>
-              <w:rPr>
-                <w:rFonts w:ascii="Times New Roman" w:hAnsi="Times New Roman" w:eastAsia="KaiTi"/>
-                <w:b w:val="0"/>
-                <w:color w:val="000000"/>
-                <w:sz w:val="15"/>
-              </w:rPr>
-              <w:t>流入6只/流出0只（缺2只）</w:t>
+              <w:spacing w:before="0" w:after="0" w:line="276" w:lineRule="auto"/>
+              <w:jc w:val="center"/>
+            </w:pPr>
+            <w:r/>
+            <w:r>
+              <w:rPr>
+                <w:rFonts w:ascii="Times New Roman" w:hAnsi="Times New Roman" w:eastAsia="KaiTi"/>
+                <w:b w:val="0"/>
+                <w:color w:val="000000"/>
+                <w:sz w:val="15"/>
+              </w:rPr>
+              <w:t>流入7只/流出0只（缺2只）</w:t>
             </w:r>
           </w:p>
         </w:tc>
@@ -12349,19 +12261,18 @@
           </w:tcPr>
           <w:p>
             <w:pPr>
-              <w:pStyle w:val="affd"/>
-              <w:spacing w:before="0" w:after="0" w:line="276" w:lineRule="auto"/>
-              <w:jc w:val="center"/>
-            </w:pPr>
-            <w:r/>
-            <w:r>
-              <w:rPr>
-                <w:rFonts w:ascii="Times New Roman" w:hAnsi="Times New Roman" w:eastAsia="KaiTi"/>
-                <w:b w:val="0"/>
-                <w:color w:val="000000"/>
-                <w:sz w:val="15"/>
-              </w:rPr>
-              <w:t>流入合计+114.77亿 / 流出合计0.00亿</w:t>
+              <w:spacing w:before="0" w:after="0" w:line="276" w:lineRule="auto"/>
+              <w:jc w:val="center"/>
+            </w:pPr>
+            <w:r/>
+            <w:r>
+              <w:rPr>
+                <w:rFonts w:ascii="Times New Roman" w:hAnsi="Times New Roman" w:eastAsia="KaiTi"/>
+                <w:b w:val="0"/>
+                <w:color w:val="000000"/>
+                <w:sz w:val="15"/>
+              </w:rPr>
+              <w:t>流入合计+114.81亿 / 流出合计0.00亿</w:t>
             </w:r>
           </w:p>
         </w:tc>
@@ -12372,7 +12283,6 @@
           </w:tcPr>
           <w:p>
             <w:pPr>
-              <w:pStyle w:val="affd"/>
               <w:spacing w:before="0" w:after="0" w:line="276" w:lineRule="auto"/>
               <w:jc w:val="center"/>
             </w:pPr>
@@ -12397,7 +12307,6 @@
           </w:tcPr>
           <w:p>
             <w:pPr>
-              <w:pStyle w:val="affd"/>
               <w:spacing w:before="0" w:after="0" w:line="276" w:lineRule="auto"/>
               <w:jc w:val="center"/>
             </w:pPr>
@@ -12420,19 +12329,18 @@
           </w:tcPr>
           <w:p>
             <w:pPr>
-              <w:pStyle w:val="affd"/>
-              <w:spacing w:before="0" w:after="0" w:line="276" w:lineRule="auto"/>
-              <w:jc w:val="center"/>
-            </w:pPr>
-            <w:r/>
-            <w:r>
-              <w:rPr>
-                <w:rFonts w:ascii="Times New Roman" w:hAnsi="Times New Roman" w:eastAsia="KaiTi"/>
-                <w:b w:val="0"/>
-                <w:color w:val="000000"/>
-                <w:sz w:val="15"/>
-              </w:rPr>
-              <w:t>+100.82</w:t>
+              <w:spacing w:before="0" w:after="0" w:line="276" w:lineRule="auto"/>
+              <w:jc w:val="center"/>
+            </w:pPr>
+            <w:r/>
+            <w:r>
+              <w:rPr>
+                <w:rFonts w:ascii="Times New Roman" w:hAnsi="Times New Roman" w:eastAsia="KaiTi"/>
+                <w:b w:val="0"/>
+                <w:color w:val="000000"/>
+                <w:sz w:val="15"/>
+              </w:rPr>
+              <w:t>+100.86</w:t>
             </w:r>
           </w:p>
         </w:tc>
@@ -12443,19 +12351,18 @@
           </w:tcPr>
           <w:p>
             <w:pPr>
-              <w:pStyle w:val="affd"/>
-              <w:spacing w:before="0" w:after="0" w:line="276" w:lineRule="auto"/>
-              <w:jc w:val="center"/>
-            </w:pPr>
-            <w:r/>
-            <w:r>
-              <w:rPr>
-                <w:rFonts w:ascii="Times New Roman" w:hAnsi="Times New Roman" w:eastAsia="KaiTi"/>
-                <w:b w:val="0"/>
-                <w:color w:val="000000"/>
-                <w:sz w:val="15"/>
-              </w:rPr>
-              <w:t>流入8只/流出0只</w:t>
+              <w:spacing w:before="0" w:after="0" w:line="276" w:lineRule="auto"/>
+              <w:jc w:val="center"/>
+            </w:pPr>
+            <w:r/>
+            <w:r>
+              <w:rPr>
+                <w:rFonts w:ascii="Times New Roman" w:hAnsi="Times New Roman" w:eastAsia="KaiTi"/>
+                <w:b w:val="0"/>
+                <w:color w:val="000000"/>
+                <w:sz w:val="15"/>
+              </w:rPr>
+              <w:t>流入9只/流出0只</w:t>
             </w:r>
           </w:p>
         </w:tc>
@@ -12466,19 +12373,18 @@
           </w:tcPr>
           <w:p>
             <w:pPr>
-              <w:pStyle w:val="affd"/>
-              <w:spacing w:before="0" w:after="0" w:line="276" w:lineRule="auto"/>
-              <w:jc w:val="center"/>
-            </w:pPr>
-            <w:r/>
-            <w:r>
-              <w:rPr>
-                <w:rFonts w:ascii="Times New Roman" w:hAnsi="Times New Roman" w:eastAsia="KaiTi"/>
-                <w:b w:val="0"/>
-                <w:color w:val="000000"/>
-                <w:sz w:val="15"/>
-              </w:rPr>
-              <w:t>流入合计+100.82亿 / 流出合计0.00亿</w:t>
+              <w:spacing w:before="0" w:after="0" w:line="276" w:lineRule="auto"/>
+              <w:jc w:val="center"/>
+            </w:pPr>
+            <w:r/>
+            <w:r>
+              <w:rPr>
+                <w:rFonts w:ascii="Times New Roman" w:hAnsi="Times New Roman" w:eastAsia="KaiTi"/>
+                <w:b w:val="0"/>
+                <w:color w:val="000000"/>
+                <w:sz w:val="15"/>
+              </w:rPr>
+              <w:t>流入合计+100.86亿 / 流出合计0.00亿</w:t>
             </w:r>
           </w:p>
         </w:tc>
@@ -12489,7 +12395,6 @@
           </w:tcPr>
           <w:p>
             <w:pPr>
-              <w:pStyle w:val="affd"/>
               <w:spacing w:before="0" w:after="0" w:line="276" w:lineRule="auto"/>
               <w:jc w:val="center"/>
             </w:pPr>
@@ -12514,7 +12419,6 @@
           </w:tcPr>
           <w:p>
             <w:pPr>
-              <w:pStyle w:val="affd"/>
               <w:spacing w:before="0" w:after="0" w:line="276" w:lineRule="auto"/>
               <w:jc w:val="center"/>
             </w:pPr>
@@ -12537,7 +12441,6 @@
           </w:tcPr>
           <w:p>
             <w:pPr>
-              <w:pStyle w:val="affd"/>
               <w:spacing w:before="0" w:after="0" w:line="276" w:lineRule="auto"/>
               <w:jc w:val="center"/>
             </w:pPr>
@@ -12560,19 +12463,18 @@
           </w:tcPr>
           <w:p>
             <w:pPr>
-              <w:pStyle w:val="affd"/>
-              <w:spacing w:before="0" w:after="0" w:line="276" w:lineRule="auto"/>
-              <w:jc w:val="center"/>
-            </w:pPr>
-            <w:r/>
-            <w:r>
-              <w:rPr>
-                <w:rFonts w:ascii="Times New Roman" w:hAnsi="Times New Roman" w:eastAsia="KaiTi"/>
-                <w:b w:val="0"/>
-                <w:color w:val="000000"/>
-                <w:sz w:val="15"/>
-              </w:rPr>
-              <w:t>流入4只/流出0只（缺4只）</w:t>
+              <w:spacing w:before="0" w:after="0" w:line="276" w:lineRule="auto"/>
+              <w:jc w:val="center"/>
+            </w:pPr>
+            <w:r/>
+            <w:r>
+              <w:rPr>
+                <w:rFonts w:ascii="Times New Roman" w:hAnsi="Times New Roman" w:eastAsia="KaiTi"/>
+                <w:b w:val="0"/>
+                <w:color w:val="000000"/>
+                <w:sz w:val="15"/>
+              </w:rPr>
+              <w:t>流入4只/流出0只（缺5只）</w:t>
             </w:r>
           </w:p>
         </w:tc>
@@ -12583,7 +12485,6 @@
           </w:tcPr>
           <w:p>
             <w:pPr>
-              <w:pStyle w:val="affd"/>
               <w:spacing w:before="0" w:after="0" w:line="276" w:lineRule="auto"/>
               <w:jc w:val="center"/>
             </w:pPr>
@@ -12606,7 +12507,6 @@
           </w:tcPr>
           <w:p>
             <w:pPr>
-              <w:pStyle w:val="affd"/>
               <w:spacing w:before="0" w:after="0" w:line="276" w:lineRule="auto"/>
               <w:jc w:val="center"/>
             </w:pPr>
@@ -12631,7 +12531,6 @@
           </w:tcPr>
           <w:p>
             <w:pPr>
-              <w:pStyle w:val="affd"/>
               <w:spacing w:before="0" w:after="0" w:line="276" w:lineRule="auto"/>
               <w:jc w:val="center"/>
             </w:pPr>
@@ -12654,7 +12553,6 @@
           </w:tcPr>
           <w:p>
             <w:pPr>
-              <w:pStyle w:val="affd"/>
               <w:spacing w:before="0" w:after="0" w:line="276" w:lineRule="auto"/>
               <w:jc w:val="center"/>
             </w:pPr>
@@ -12677,19 +12575,18 @@
           </w:tcPr>
           <w:p>
             <w:pPr>
-              <w:pStyle w:val="affd"/>
-              <w:spacing w:before="0" w:after="0" w:line="276" w:lineRule="auto"/>
-              <w:jc w:val="center"/>
-            </w:pPr>
-            <w:r/>
-            <w:r>
-              <w:rPr>
-                <w:rFonts w:ascii="Times New Roman" w:hAnsi="Times New Roman" w:eastAsia="KaiTi"/>
-                <w:b w:val="0"/>
-                <w:color w:val="000000"/>
-                <w:sz w:val="15"/>
-              </w:rPr>
-              <w:t>流入3只/流出0只（缺5只）</w:t>
+              <w:spacing w:before="0" w:after="0" w:line="276" w:lineRule="auto"/>
+              <w:jc w:val="center"/>
+            </w:pPr>
+            <w:r/>
+            <w:r>
+              <w:rPr>
+                <w:rFonts w:ascii="Times New Roman" w:hAnsi="Times New Roman" w:eastAsia="KaiTi"/>
+                <w:b w:val="0"/>
+                <w:color w:val="000000"/>
+                <w:sz w:val="15"/>
+              </w:rPr>
+              <w:t>流入3只/流出0只（缺6只）</w:t>
             </w:r>
           </w:p>
         </w:tc>
@@ -12700,7 +12597,6 @@
           </w:tcPr>
           <w:p>
             <w:pPr>
-              <w:pStyle w:val="affd"/>
               <w:spacing w:before="0" w:after="0" w:line="276" w:lineRule="auto"/>
               <w:jc w:val="center"/>
             </w:pPr>
@@ -12723,7 +12619,6 @@
           </w:tcPr>
           <w:p>
             <w:pPr>
-              <w:pStyle w:val="affd"/>
               <w:spacing w:before="0" w:after="0" w:line="276" w:lineRule="auto"/>
               <w:jc w:val="center"/>
             </w:pPr>
@@ -12768,7 +12663,7 @@
           <w:color w:val="6B7280"/>
           <w:sz w:val="18"/>
         </w:rPr>
-        <w:t>注：Flow_3Yr仅覆盖成立满3年的产品（JPMorgan 3/8只、First Trust 56/142只、Innovator 75/165只、NEOS 1/8只、Global X 16/33只），与较短时间窗口数据不可直接横向对比。流入/流出明细为各产品正/负流向各自加总，两者相抵后等于净流量合计。</w:t>
+        <w:t>注：Flow_3Yr仅覆盖成立满3年的产品（JPMorgan 3/9只、First Trust 56/154只、Innovator 75/165只、NEOS 1/8只、Global X 16/33只），与较短时间窗口数据不可直接横向对比。流入/流出明细为各产品正/负流向各自加总，两者相抵后等于净流量合计。</w:t>
       </w:r>
     </w:p>
     <w:p>
@@ -12797,7 +12692,7 @@
           <w:color w:val="000000"/>
           <w:sz w:val="22"/>
         </w:rPr>
-        <w:t>First Trust在使用期权的衍生策略ETF中AUM约594.73亿美元，产品数量142只，覆盖收益增强16只、风险缓冲124只、另类策略2只，AUM加权费率为0.65%。</w:t>
+        <w:t>First Trust在使用期权的衍生策略ETF中AUM约596.94亿美元，产品数量154只，覆盖收益增强16只、风险缓冲136只、另类策略2只，AUM加权费率为0.65%。</w:t>
       </w:r>
     </w:p>
     <w:p>
@@ -12846,7 +12741,6 @@
           </w:tcPr>
           <w:p>
             <w:pPr>
-              <w:pStyle w:val="affd"/>
               <w:spacing w:before="0" w:after="0" w:line="276" w:lineRule="auto"/>
               <w:jc w:val="center"/>
             </w:pPr>
@@ -12870,7 +12764,6 @@
           </w:tcPr>
           <w:p>
             <w:pPr>
-              <w:pStyle w:val="affd"/>
               <w:spacing w:before="0" w:after="0" w:line="276" w:lineRule="auto"/>
               <w:jc w:val="center"/>
             </w:pPr>
@@ -12894,7 +12787,6 @@
           </w:tcPr>
           <w:p>
             <w:pPr>
-              <w:pStyle w:val="affd"/>
               <w:spacing w:before="0" w:after="0" w:line="276" w:lineRule="auto"/>
               <w:jc w:val="center"/>
             </w:pPr>
@@ -12918,7 +12810,6 @@
           </w:tcPr>
           <w:p>
             <w:pPr>
-              <w:pStyle w:val="affd"/>
               <w:spacing w:before="0" w:after="0" w:line="276" w:lineRule="auto"/>
               <w:jc w:val="center"/>
             </w:pPr>
@@ -12942,7 +12833,6 @@
           </w:tcPr>
           <w:p>
             <w:pPr>
-              <w:pStyle w:val="affd"/>
               <w:spacing w:before="0" w:after="0" w:line="276" w:lineRule="auto"/>
               <w:jc w:val="center"/>
             </w:pPr>
@@ -12967,17 +12857,16 @@
           </w:tcPr>
           <w:p>
             <w:pPr>
-              <w:pStyle w:val="affd"/>
-              <w:spacing w:before="0" w:after="0" w:line="276" w:lineRule="auto"/>
-              <w:jc w:val="center"/>
-            </w:pPr>
-            <w:r/>
-            <w:r>
-              <w:rPr>
-                <w:rFonts w:ascii="Times New Roman" w:hAnsi="Times New Roman" w:eastAsia="KaiTi"/>
-                <w:b w:val="0"/>
-                <w:color w:val="000000"/>
-                <w:sz w:val="16"/>
+              <w:spacing w:before="0" w:after="0" w:line="276" w:lineRule="auto"/>
+              <w:jc w:val="center"/>
+            </w:pPr>
+            <w:r/>
+            <w:r>
+              <w:rPr>
+                <w:rFonts w:ascii="Times New Roman" w:hAnsi="Times New Roman" w:eastAsia="KaiTi"/>
+                <w:b w:val="0"/>
+                <w:color w:val="000000"/>
+                <w:sz w:val="15"/>
               </w:rPr>
               <w:t>2011</w:t>
             </w:r>
@@ -12990,17 +12879,16 @@
           </w:tcPr>
           <w:p>
             <w:pPr>
-              <w:pStyle w:val="affd"/>
-              <w:spacing w:before="0" w:after="0" w:line="276" w:lineRule="auto"/>
-              <w:jc w:val="center"/>
-            </w:pPr>
-            <w:r/>
-            <w:r>
-              <w:rPr>
-                <w:rFonts w:ascii="Times New Roman" w:hAnsi="Times New Roman" w:eastAsia="KaiTi"/>
-                <w:b w:val="0"/>
-                <w:color w:val="000000"/>
-                <w:sz w:val="16"/>
+              <w:spacing w:before="0" w:after="0" w:line="276" w:lineRule="auto"/>
+              <w:jc w:val="center"/>
+            </w:pPr>
+            <w:r/>
+            <w:r>
+              <w:rPr>
+                <w:rFonts w:ascii="Times New Roman" w:hAnsi="Times New Roman" w:eastAsia="KaiTi"/>
+                <w:b w:val="0"/>
+                <w:color w:val="000000"/>
+                <w:sz w:val="15"/>
               </w:rPr>
               <w:t>1</w:t>
             </w:r>
@@ -13013,17 +12901,16 @@
           </w:tcPr>
           <w:p>
             <w:pPr>
-              <w:pStyle w:val="affd"/>
-              <w:spacing w:before="0" w:after="0" w:line="276" w:lineRule="auto"/>
-              <w:jc w:val="center"/>
-            </w:pPr>
-            <w:r/>
-            <w:r>
-              <w:rPr>
-                <w:rFonts w:ascii="Times New Roman" w:hAnsi="Times New Roman" w:eastAsia="KaiTi"/>
-                <w:b w:val="0"/>
-                <w:color w:val="000000"/>
-                <w:sz w:val="16"/>
+              <w:spacing w:before="0" w:after="0" w:line="276" w:lineRule="auto"/>
+              <w:jc w:val="center"/>
+            </w:pPr>
+            <w:r/>
+            <w:r>
+              <w:rPr>
+                <w:rFonts w:ascii="Times New Roman" w:hAnsi="Times New Roman" w:eastAsia="KaiTi"/>
+                <w:b w:val="0"/>
+                <w:color w:val="000000"/>
+                <w:sz w:val="15"/>
               </w:rPr>
               <w:t>-</w:t>
             </w:r>
@@ -13036,17 +12923,16 @@
           </w:tcPr>
           <w:p>
             <w:pPr>
-              <w:pStyle w:val="affd"/>
-              <w:spacing w:before="0" w:after="0" w:line="276" w:lineRule="auto"/>
-              <w:jc w:val="center"/>
-            </w:pPr>
-            <w:r/>
-            <w:r>
-              <w:rPr>
-                <w:rFonts w:ascii="Times New Roman" w:hAnsi="Times New Roman" w:eastAsia="KaiTi"/>
-                <w:b w:val="0"/>
-                <w:color w:val="000000"/>
-                <w:sz w:val="16"/>
+              <w:spacing w:before="0" w:after="0" w:line="276" w:lineRule="auto"/>
+              <w:jc w:val="center"/>
+            </w:pPr>
+            <w:r/>
+            <w:r>
+              <w:rPr>
+                <w:rFonts w:ascii="Times New Roman" w:hAnsi="Times New Roman" w:eastAsia="KaiTi"/>
+                <w:b w:val="0"/>
+                <w:color w:val="000000"/>
+                <w:sz w:val="15"/>
               </w:rPr>
               <w:t>-</w:t>
             </w:r>
@@ -13059,17 +12945,16 @@
           </w:tcPr>
           <w:p>
             <w:pPr>
-              <w:pStyle w:val="affd"/>
-              <w:spacing w:before="0" w:after="0" w:line="276" w:lineRule="auto"/>
-              <w:jc w:val="center"/>
-            </w:pPr>
-            <w:r/>
-            <w:r>
-              <w:rPr>
-                <w:rFonts w:ascii="Times New Roman" w:hAnsi="Times New Roman" w:eastAsia="KaiTi"/>
-                <w:b w:val="0"/>
-                <w:color w:val="000000"/>
-                <w:sz w:val="16"/>
+              <w:spacing w:before="0" w:after="0" w:line="276" w:lineRule="auto"/>
+              <w:jc w:val="center"/>
+            </w:pPr>
+            <w:r/>
+            <w:r>
+              <w:rPr>
+                <w:rFonts w:ascii="Times New Roman" w:hAnsi="Times New Roman" w:eastAsia="KaiTi"/>
+                <w:b w:val="0"/>
+                <w:color w:val="000000"/>
+                <w:sz w:val="15"/>
               </w:rPr>
               <w:t>1</w:t>
             </w:r>
@@ -13084,17 +12969,16 @@
           </w:tcPr>
           <w:p>
             <w:pPr>
-              <w:pStyle w:val="affd"/>
-              <w:spacing w:before="0" w:after="0" w:line="276" w:lineRule="auto"/>
-              <w:jc w:val="center"/>
-            </w:pPr>
-            <w:r/>
-            <w:r>
-              <w:rPr>
-                <w:rFonts w:ascii="Times New Roman" w:hAnsi="Times New Roman" w:eastAsia="KaiTi"/>
-                <w:b w:val="0"/>
-                <w:color w:val="000000"/>
-                <w:sz w:val="16"/>
+              <w:spacing w:before="0" w:after="0" w:line="276" w:lineRule="auto"/>
+              <w:jc w:val="center"/>
+            </w:pPr>
+            <w:r/>
+            <w:r>
+              <w:rPr>
+                <w:rFonts w:ascii="Times New Roman" w:hAnsi="Times New Roman" w:eastAsia="KaiTi"/>
+                <w:b w:val="0"/>
+                <w:color w:val="000000"/>
+                <w:sz w:val="15"/>
               </w:rPr>
               <w:t>2014</w:t>
             </w:r>
@@ -13107,17 +12991,16 @@
           </w:tcPr>
           <w:p>
             <w:pPr>
-              <w:pStyle w:val="affd"/>
-              <w:spacing w:before="0" w:after="0" w:line="276" w:lineRule="auto"/>
-              <w:jc w:val="center"/>
-            </w:pPr>
-            <w:r/>
-            <w:r>
-              <w:rPr>
-                <w:rFonts w:ascii="Times New Roman" w:hAnsi="Times New Roman" w:eastAsia="KaiTi"/>
-                <w:b w:val="0"/>
-                <w:color w:val="000000"/>
-                <w:sz w:val="16"/>
+              <w:spacing w:before="0" w:after="0" w:line="276" w:lineRule="auto"/>
+              <w:jc w:val="center"/>
+            </w:pPr>
+            <w:r/>
+            <w:r>
+              <w:rPr>
+                <w:rFonts w:ascii="Times New Roman" w:hAnsi="Times New Roman" w:eastAsia="KaiTi"/>
+                <w:b w:val="0"/>
+                <w:color w:val="000000"/>
+                <w:sz w:val="15"/>
               </w:rPr>
               <w:t>2</w:t>
             </w:r>
@@ -13130,17 +13013,16 @@
           </w:tcPr>
           <w:p>
             <w:pPr>
-              <w:pStyle w:val="affd"/>
-              <w:spacing w:before="0" w:after="0" w:line="276" w:lineRule="auto"/>
-              <w:jc w:val="center"/>
-            </w:pPr>
-            <w:r/>
-            <w:r>
-              <w:rPr>
-                <w:rFonts w:ascii="Times New Roman" w:hAnsi="Times New Roman" w:eastAsia="KaiTi"/>
-                <w:b w:val="0"/>
-                <w:color w:val="000000"/>
-                <w:sz w:val="16"/>
+              <w:spacing w:before="0" w:after="0" w:line="276" w:lineRule="auto"/>
+              <w:jc w:val="center"/>
+            </w:pPr>
+            <w:r/>
+            <w:r>
+              <w:rPr>
+                <w:rFonts w:ascii="Times New Roman" w:hAnsi="Times New Roman" w:eastAsia="KaiTi"/>
+                <w:b w:val="0"/>
+                <w:color w:val="000000"/>
+                <w:sz w:val="15"/>
               </w:rPr>
               <w:t>-</w:t>
             </w:r>
@@ -13153,17 +13035,16 @@
           </w:tcPr>
           <w:p>
             <w:pPr>
-              <w:pStyle w:val="affd"/>
-              <w:spacing w:before="0" w:after="0" w:line="276" w:lineRule="auto"/>
-              <w:jc w:val="center"/>
-            </w:pPr>
-            <w:r/>
-            <w:r>
-              <w:rPr>
-                <w:rFonts w:ascii="Times New Roman" w:hAnsi="Times New Roman" w:eastAsia="KaiTi"/>
-                <w:b w:val="0"/>
-                <w:color w:val="000000"/>
-                <w:sz w:val="16"/>
+              <w:spacing w:before="0" w:after="0" w:line="276" w:lineRule="auto"/>
+              <w:jc w:val="center"/>
+            </w:pPr>
+            <w:r/>
+            <w:r>
+              <w:rPr>
+                <w:rFonts w:ascii="Times New Roman" w:hAnsi="Times New Roman" w:eastAsia="KaiTi"/>
+                <w:b w:val="0"/>
+                <w:color w:val="000000"/>
+                <w:sz w:val="15"/>
               </w:rPr>
               <w:t>-</w:t>
             </w:r>
@@ -13176,17 +13057,16 @@
           </w:tcPr>
           <w:p>
             <w:pPr>
-              <w:pStyle w:val="affd"/>
-              <w:spacing w:before="0" w:after="0" w:line="276" w:lineRule="auto"/>
-              <w:jc w:val="center"/>
-            </w:pPr>
-            <w:r/>
-            <w:r>
-              <w:rPr>
-                <w:rFonts w:ascii="Times New Roman" w:hAnsi="Times New Roman" w:eastAsia="KaiTi"/>
-                <w:b w:val="0"/>
-                <w:color w:val="000000"/>
-                <w:sz w:val="16"/>
+              <w:spacing w:before="0" w:after="0" w:line="276" w:lineRule="auto"/>
+              <w:jc w:val="center"/>
+            </w:pPr>
+            <w:r/>
+            <w:r>
+              <w:rPr>
+                <w:rFonts w:ascii="Times New Roman" w:hAnsi="Times New Roman" w:eastAsia="KaiTi"/>
+                <w:b w:val="0"/>
+                <w:color w:val="000000"/>
+                <w:sz w:val="15"/>
               </w:rPr>
               <w:t>2</w:t>
             </w:r>
@@ -13201,17 +13081,16 @@
           </w:tcPr>
           <w:p>
             <w:pPr>
-              <w:pStyle w:val="affd"/>
-              <w:spacing w:before="0" w:after="0" w:line="276" w:lineRule="auto"/>
-              <w:jc w:val="center"/>
-            </w:pPr>
-            <w:r/>
-            <w:r>
-              <w:rPr>
-                <w:rFonts w:ascii="Times New Roman" w:hAnsi="Times New Roman" w:eastAsia="KaiTi"/>
-                <w:b w:val="0"/>
-                <w:color w:val="000000"/>
-                <w:sz w:val="16"/>
+              <w:spacing w:before="0" w:after="0" w:line="276" w:lineRule="auto"/>
+              <w:jc w:val="center"/>
+            </w:pPr>
+            <w:r/>
+            <w:r>
+              <w:rPr>
+                <w:rFonts w:ascii="Times New Roman" w:hAnsi="Times New Roman" w:eastAsia="KaiTi"/>
+                <w:b w:val="0"/>
+                <w:color w:val="000000"/>
+                <w:sz w:val="15"/>
               </w:rPr>
               <w:t>2017</w:t>
             </w:r>
@@ -13224,17 +13103,16 @@
           </w:tcPr>
           <w:p>
             <w:pPr>
-              <w:pStyle w:val="affd"/>
-              <w:spacing w:before="0" w:after="0" w:line="276" w:lineRule="auto"/>
-              <w:jc w:val="center"/>
-            </w:pPr>
-            <w:r/>
-            <w:r>
-              <w:rPr>
-                <w:rFonts w:ascii="Times New Roman" w:hAnsi="Times New Roman" w:eastAsia="KaiTi"/>
-                <w:b w:val="0"/>
-                <w:color w:val="000000"/>
-                <w:sz w:val="16"/>
+              <w:spacing w:before="0" w:after="0" w:line="276" w:lineRule="auto"/>
+              <w:jc w:val="center"/>
+            </w:pPr>
+            <w:r/>
+            <w:r>
+              <w:rPr>
+                <w:rFonts w:ascii="Times New Roman" w:hAnsi="Times New Roman" w:eastAsia="KaiTi"/>
+                <w:b w:val="0"/>
+                <w:color w:val="000000"/>
+                <w:sz w:val="15"/>
               </w:rPr>
               <w:t>-</w:t>
             </w:r>
@@ -13247,17 +13125,16 @@
           </w:tcPr>
           <w:p>
             <w:pPr>
-              <w:pStyle w:val="affd"/>
-              <w:spacing w:before="0" w:after="0" w:line="276" w:lineRule="auto"/>
-              <w:jc w:val="center"/>
-            </w:pPr>
-            <w:r/>
-            <w:r>
-              <w:rPr>
-                <w:rFonts w:ascii="Times New Roman" w:hAnsi="Times New Roman" w:eastAsia="KaiTi"/>
-                <w:b w:val="0"/>
-                <w:color w:val="000000"/>
-                <w:sz w:val="16"/>
+              <w:spacing w:before="0" w:after="0" w:line="276" w:lineRule="auto"/>
+              <w:jc w:val="center"/>
+            </w:pPr>
+            <w:r/>
+            <w:r>
+              <w:rPr>
+                <w:rFonts w:ascii="Times New Roman" w:hAnsi="Times New Roman" w:eastAsia="KaiTi"/>
+                <w:b w:val="0"/>
+                <w:color w:val="000000"/>
+                <w:sz w:val="15"/>
               </w:rPr>
               <w:t>-</w:t>
             </w:r>
@@ -13270,17 +13147,16 @@
           </w:tcPr>
           <w:p>
             <w:pPr>
-              <w:pStyle w:val="affd"/>
-              <w:spacing w:before="0" w:after="0" w:line="276" w:lineRule="auto"/>
-              <w:jc w:val="center"/>
-            </w:pPr>
-            <w:r/>
-            <w:r>
-              <w:rPr>
-                <w:rFonts w:ascii="Times New Roman" w:hAnsi="Times New Roman" w:eastAsia="KaiTi"/>
-                <w:b w:val="0"/>
-                <w:color w:val="000000"/>
-                <w:sz w:val="16"/>
+              <w:spacing w:before="0" w:after="0" w:line="276" w:lineRule="auto"/>
+              <w:jc w:val="center"/>
+            </w:pPr>
+            <w:r/>
+            <w:r>
+              <w:rPr>
+                <w:rFonts w:ascii="Times New Roman" w:hAnsi="Times New Roman" w:eastAsia="KaiTi"/>
+                <w:b w:val="0"/>
+                <w:color w:val="000000"/>
+                <w:sz w:val="15"/>
               </w:rPr>
               <w:t>1</w:t>
             </w:r>
@@ -13293,17 +13169,16 @@
           </w:tcPr>
           <w:p>
             <w:pPr>
-              <w:pStyle w:val="affd"/>
-              <w:spacing w:before="0" w:after="0" w:line="276" w:lineRule="auto"/>
-              <w:jc w:val="center"/>
-            </w:pPr>
-            <w:r/>
-            <w:r>
-              <w:rPr>
-                <w:rFonts w:ascii="Times New Roman" w:hAnsi="Times New Roman" w:eastAsia="KaiTi"/>
-                <w:b w:val="0"/>
-                <w:color w:val="000000"/>
-                <w:sz w:val="16"/>
+              <w:spacing w:before="0" w:after="0" w:line="276" w:lineRule="auto"/>
+              <w:jc w:val="center"/>
+            </w:pPr>
+            <w:r/>
+            <w:r>
+              <w:rPr>
+                <w:rFonts w:ascii="Times New Roman" w:hAnsi="Times New Roman" w:eastAsia="KaiTi"/>
+                <w:b w:val="0"/>
+                <w:color w:val="000000"/>
+                <w:sz w:val="15"/>
               </w:rPr>
               <w:t>1</w:t>
             </w:r>
@@ -13318,17 +13193,16 @@
           </w:tcPr>
           <w:p>
             <w:pPr>
-              <w:pStyle w:val="affd"/>
-              <w:spacing w:before="0" w:after="0" w:line="276" w:lineRule="auto"/>
-              <w:jc w:val="center"/>
-            </w:pPr>
-            <w:r/>
-            <w:r>
-              <w:rPr>
-                <w:rFonts w:ascii="Times New Roman" w:hAnsi="Times New Roman" w:eastAsia="KaiTi"/>
-                <w:b w:val="0"/>
-                <w:color w:val="000000"/>
-                <w:sz w:val="16"/>
+              <w:spacing w:before="0" w:after="0" w:line="276" w:lineRule="auto"/>
+              <w:jc w:val="center"/>
+            </w:pPr>
+            <w:r/>
+            <w:r>
+              <w:rPr>
+                <w:rFonts w:ascii="Times New Roman" w:hAnsi="Times New Roman" w:eastAsia="KaiTi"/>
+                <w:b w:val="0"/>
+                <w:color w:val="000000"/>
+                <w:sz w:val="15"/>
               </w:rPr>
               <w:t>2018</w:t>
             </w:r>
@@ -13341,17 +13215,16 @@
           </w:tcPr>
           <w:p>
             <w:pPr>
-              <w:pStyle w:val="affd"/>
-              <w:spacing w:before="0" w:after="0" w:line="276" w:lineRule="auto"/>
-              <w:jc w:val="center"/>
-            </w:pPr>
-            <w:r/>
-            <w:r>
-              <w:rPr>
-                <w:rFonts w:ascii="Times New Roman" w:hAnsi="Times New Roman" w:eastAsia="KaiTi"/>
-                <w:b w:val="0"/>
-                <w:color w:val="000000"/>
-                <w:sz w:val="16"/>
+              <w:spacing w:before="0" w:after="0" w:line="276" w:lineRule="auto"/>
+              <w:jc w:val="center"/>
+            </w:pPr>
+            <w:r/>
+            <w:r>
+              <w:rPr>
+                <w:rFonts w:ascii="Times New Roman" w:hAnsi="Times New Roman" w:eastAsia="KaiTi"/>
+                <w:b w:val="0"/>
+                <w:color w:val="000000"/>
+                <w:sz w:val="15"/>
               </w:rPr>
               <w:t>1</w:t>
             </w:r>
@@ -13364,17 +13237,16 @@
           </w:tcPr>
           <w:p>
             <w:pPr>
-              <w:pStyle w:val="affd"/>
-              <w:spacing w:before="0" w:after="0" w:line="276" w:lineRule="auto"/>
-              <w:jc w:val="center"/>
-            </w:pPr>
-            <w:r/>
-            <w:r>
-              <w:rPr>
-                <w:rFonts w:ascii="Times New Roman" w:hAnsi="Times New Roman" w:eastAsia="KaiTi"/>
-                <w:b w:val="0"/>
-                <w:color w:val="000000"/>
-                <w:sz w:val="16"/>
+              <w:spacing w:before="0" w:after="0" w:line="276" w:lineRule="auto"/>
+              <w:jc w:val="center"/>
+            </w:pPr>
+            <w:r/>
+            <w:r>
+              <w:rPr>
+                <w:rFonts w:ascii="Times New Roman" w:hAnsi="Times New Roman" w:eastAsia="KaiTi"/>
+                <w:b w:val="0"/>
+                <w:color w:val="000000"/>
+                <w:sz w:val="15"/>
               </w:rPr>
               <w:t>-</w:t>
             </w:r>
@@ -13387,17 +13259,16 @@
           </w:tcPr>
           <w:p>
             <w:pPr>
-              <w:pStyle w:val="affd"/>
-              <w:spacing w:before="0" w:after="0" w:line="276" w:lineRule="auto"/>
-              <w:jc w:val="center"/>
-            </w:pPr>
-            <w:r/>
-            <w:r>
-              <w:rPr>
-                <w:rFonts w:ascii="Times New Roman" w:hAnsi="Times New Roman" w:eastAsia="KaiTi"/>
-                <w:b w:val="0"/>
-                <w:color w:val="000000"/>
-                <w:sz w:val="16"/>
+              <w:spacing w:before="0" w:after="0" w:line="276" w:lineRule="auto"/>
+              <w:jc w:val="center"/>
+            </w:pPr>
+            <w:r/>
+            <w:r>
+              <w:rPr>
+                <w:rFonts w:ascii="Times New Roman" w:hAnsi="Times New Roman" w:eastAsia="KaiTi"/>
+                <w:b w:val="0"/>
+                <w:color w:val="000000"/>
+                <w:sz w:val="15"/>
               </w:rPr>
               <w:t>-</w:t>
             </w:r>
@@ -13410,17 +13281,16 @@
           </w:tcPr>
           <w:p>
             <w:pPr>
-              <w:pStyle w:val="affd"/>
-              <w:spacing w:before="0" w:after="0" w:line="276" w:lineRule="auto"/>
-              <w:jc w:val="center"/>
-            </w:pPr>
-            <w:r/>
-            <w:r>
-              <w:rPr>
-                <w:rFonts w:ascii="Times New Roman" w:hAnsi="Times New Roman" w:eastAsia="KaiTi"/>
-                <w:b w:val="0"/>
-                <w:color w:val="000000"/>
-                <w:sz w:val="16"/>
+              <w:spacing w:before="0" w:after="0" w:line="276" w:lineRule="auto"/>
+              <w:jc w:val="center"/>
+            </w:pPr>
+            <w:r/>
+            <w:r>
+              <w:rPr>
+                <w:rFonts w:ascii="Times New Roman" w:hAnsi="Times New Roman" w:eastAsia="KaiTi"/>
+                <w:b w:val="0"/>
+                <w:color w:val="000000"/>
+                <w:sz w:val="15"/>
               </w:rPr>
               <w:t>1</w:t>
             </w:r>
@@ -13435,17 +13305,16 @@
           </w:tcPr>
           <w:p>
             <w:pPr>
-              <w:pStyle w:val="affd"/>
-              <w:spacing w:before="0" w:after="0" w:line="276" w:lineRule="auto"/>
-              <w:jc w:val="center"/>
-            </w:pPr>
-            <w:r/>
-            <w:r>
-              <w:rPr>
-                <w:rFonts w:ascii="Times New Roman" w:hAnsi="Times New Roman" w:eastAsia="KaiTi"/>
-                <w:b w:val="0"/>
-                <w:color w:val="000000"/>
-                <w:sz w:val="16"/>
+              <w:spacing w:before="0" w:after="0" w:line="276" w:lineRule="auto"/>
+              <w:jc w:val="center"/>
+            </w:pPr>
+            <w:r/>
+            <w:r>
+              <w:rPr>
+                <w:rFonts w:ascii="Times New Roman" w:hAnsi="Times New Roman" w:eastAsia="KaiTi"/>
+                <w:b w:val="0"/>
+                <w:color w:val="000000"/>
+                <w:sz w:val="15"/>
               </w:rPr>
               <w:t>2019</w:t>
             </w:r>
@@ -13458,17 +13327,16 @@
           </w:tcPr>
           <w:p>
             <w:pPr>
-              <w:pStyle w:val="affd"/>
-              <w:spacing w:before="0" w:after="0" w:line="276" w:lineRule="auto"/>
-              <w:jc w:val="center"/>
-            </w:pPr>
-            <w:r/>
-            <w:r>
-              <w:rPr>
-                <w:rFonts w:ascii="Times New Roman" w:hAnsi="Times New Roman" w:eastAsia="KaiTi"/>
-                <w:b w:val="0"/>
-                <w:color w:val="000000"/>
-                <w:sz w:val="16"/>
+              <w:spacing w:before="0" w:after="0" w:line="276" w:lineRule="auto"/>
+              <w:jc w:val="center"/>
+            </w:pPr>
+            <w:r/>
+            <w:r>
+              <w:rPr>
+                <w:rFonts w:ascii="Times New Roman" w:hAnsi="Times New Roman" w:eastAsia="KaiTi"/>
+                <w:b w:val="0"/>
+                <w:color w:val="000000"/>
+                <w:sz w:val="15"/>
               </w:rPr>
               <w:t>-</w:t>
             </w:r>
@@ -13481,17 +13349,16 @@
           </w:tcPr>
           <w:p>
             <w:pPr>
-              <w:pStyle w:val="affd"/>
-              <w:spacing w:before="0" w:after="0" w:line="276" w:lineRule="auto"/>
-              <w:jc w:val="center"/>
-            </w:pPr>
-            <w:r/>
-            <w:r>
-              <w:rPr>
-                <w:rFonts w:ascii="Times New Roman" w:hAnsi="Times New Roman" w:eastAsia="KaiTi"/>
-                <w:b w:val="0"/>
-                <w:color w:val="000000"/>
-                <w:sz w:val="16"/>
+              <w:spacing w:before="0" w:after="0" w:line="276" w:lineRule="auto"/>
+              <w:jc w:val="center"/>
+            </w:pPr>
+            <w:r/>
+            <w:r>
+              <w:rPr>
+                <w:rFonts w:ascii="Times New Roman" w:hAnsi="Times New Roman" w:eastAsia="KaiTi"/>
+                <w:b w:val="0"/>
+                <w:color w:val="000000"/>
+                <w:sz w:val="15"/>
               </w:rPr>
               <w:t>4</w:t>
             </w:r>
@@ -13504,17 +13371,16 @@
           </w:tcPr>
           <w:p>
             <w:pPr>
-              <w:pStyle w:val="affd"/>
-              <w:spacing w:before="0" w:after="0" w:line="276" w:lineRule="auto"/>
-              <w:jc w:val="center"/>
-            </w:pPr>
-            <w:r/>
-            <w:r>
-              <w:rPr>
-                <w:rFonts w:ascii="Times New Roman" w:hAnsi="Times New Roman" w:eastAsia="KaiTi"/>
-                <w:b w:val="0"/>
-                <w:color w:val="000000"/>
-                <w:sz w:val="16"/>
+              <w:spacing w:before="0" w:after="0" w:line="276" w:lineRule="auto"/>
+              <w:jc w:val="center"/>
+            </w:pPr>
+            <w:r/>
+            <w:r>
+              <w:rPr>
+                <w:rFonts w:ascii="Times New Roman" w:hAnsi="Times New Roman" w:eastAsia="KaiTi"/>
+                <w:b w:val="0"/>
+                <w:color w:val="000000"/>
+                <w:sz w:val="15"/>
               </w:rPr>
               <w:t>-</w:t>
             </w:r>
@@ -13527,17 +13393,16 @@
           </w:tcPr>
           <w:p>
             <w:pPr>
-              <w:pStyle w:val="affd"/>
-              <w:spacing w:before="0" w:after="0" w:line="276" w:lineRule="auto"/>
-              <w:jc w:val="center"/>
-            </w:pPr>
-            <w:r/>
-            <w:r>
-              <w:rPr>
-                <w:rFonts w:ascii="Times New Roman" w:hAnsi="Times New Roman" w:eastAsia="KaiTi"/>
-                <w:b w:val="0"/>
-                <w:color w:val="000000"/>
-                <w:sz w:val="16"/>
+              <w:spacing w:before="0" w:after="0" w:line="276" w:lineRule="auto"/>
+              <w:jc w:val="center"/>
+            </w:pPr>
+            <w:r/>
+            <w:r>
+              <w:rPr>
+                <w:rFonts w:ascii="Times New Roman" w:hAnsi="Times New Roman" w:eastAsia="KaiTi"/>
+                <w:b w:val="0"/>
+                <w:color w:val="000000"/>
+                <w:sz w:val="15"/>
               </w:rPr>
               <w:t>4</w:t>
             </w:r>
@@ -13552,17 +13417,16 @@
           </w:tcPr>
           <w:p>
             <w:pPr>
-              <w:pStyle w:val="affd"/>
-              <w:spacing w:before="0" w:after="0" w:line="276" w:lineRule="auto"/>
-              <w:jc w:val="center"/>
-            </w:pPr>
-            <w:r/>
-            <w:r>
-              <w:rPr>
-                <w:rFonts w:ascii="Times New Roman" w:hAnsi="Times New Roman" w:eastAsia="KaiTi"/>
-                <w:b w:val="0"/>
-                <w:color w:val="000000"/>
-                <w:sz w:val="16"/>
+              <w:spacing w:before="0" w:after="0" w:line="276" w:lineRule="auto"/>
+              <w:jc w:val="center"/>
+            </w:pPr>
+            <w:r/>
+            <w:r>
+              <w:rPr>
+                <w:rFonts w:ascii="Times New Roman" w:hAnsi="Times New Roman" w:eastAsia="KaiTi"/>
+                <w:b w:val="0"/>
+                <w:color w:val="000000"/>
+                <w:sz w:val="15"/>
               </w:rPr>
               <w:t>2020</w:t>
             </w:r>
@@ -13575,17 +13439,16 @@
           </w:tcPr>
           <w:p>
             <w:pPr>
-              <w:pStyle w:val="affd"/>
-              <w:spacing w:before="0" w:after="0" w:line="276" w:lineRule="auto"/>
-              <w:jc w:val="center"/>
-            </w:pPr>
-            <w:r/>
-            <w:r>
-              <w:rPr>
-                <w:rFonts w:ascii="Times New Roman" w:hAnsi="Times New Roman" w:eastAsia="KaiTi"/>
-                <w:b w:val="0"/>
-                <w:color w:val="000000"/>
-                <w:sz w:val="16"/>
+              <w:spacing w:before="0" w:after="0" w:line="276" w:lineRule="auto"/>
+              <w:jc w:val="center"/>
+            </w:pPr>
+            <w:r/>
+            <w:r>
+              <w:rPr>
+                <w:rFonts w:ascii="Times New Roman" w:hAnsi="Times New Roman" w:eastAsia="KaiTi"/>
+                <w:b w:val="0"/>
+                <w:color w:val="000000"/>
+                <w:sz w:val="15"/>
               </w:rPr>
               <w:t>-</w:t>
             </w:r>
@@ -13598,17 +13461,16 @@
           </w:tcPr>
           <w:p>
             <w:pPr>
-              <w:pStyle w:val="affd"/>
-              <w:spacing w:before="0" w:after="0" w:line="276" w:lineRule="auto"/>
-              <w:jc w:val="center"/>
-            </w:pPr>
-            <w:r/>
-            <w:r>
-              <w:rPr>
-                <w:rFonts w:ascii="Times New Roman" w:hAnsi="Times New Roman" w:eastAsia="KaiTi"/>
-                <w:b w:val="0"/>
-                <w:color w:val="000000"/>
-                <w:sz w:val="16"/>
+              <w:spacing w:before="0" w:after="0" w:line="276" w:lineRule="auto"/>
+              <w:jc w:val="center"/>
+            </w:pPr>
+            <w:r/>
+            <w:r>
+              <w:rPr>
+                <w:rFonts w:ascii="Times New Roman" w:hAnsi="Times New Roman" w:eastAsia="KaiTi"/>
+                <w:b w:val="0"/>
+                <w:color w:val="000000"/>
+                <w:sz w:val="15"/>
               </w:rPr>
               <w:t>17</w:t>
             </w:r>
@@ -13621,17 +13483,16 @@
           </w:tcPr>
           <w:p>
             <w:pPr>
-              <w:pStyle w:val="affd"/>
-              <w:spacing w:before="0" w:after="0" w:line="276" w:lineRule="auto"/>
-              <w:jc w:val="center"/>
-            </w:pPr>
-            <w:r/>
-            <w:r>
-              <w:rPr>
-                <w:rFonts w:ascii="Times New Roman" w:hAnsi="Times New Roman" w:eastAsia="KaiTi"/>
-                <w:b w:val="0"/>
-                <w:color w:val="000000"/>
-                <w:sz w:val="16"/>
+              <w:spacing w:before="0" w:after="0" w:line="276" w:lineRule="auto"/>
+              <w:jc w:val="center"/>
+            </w:pPr>
+            <w:r/>
+            <w:r>
+              <w:rPr>
+                <w:rFonts w:ascii="Times New Roman" w:hAnsi="Times New Roman" w:eastAsia="KaiTi"/>
+                <w:b w:val="0"/>
+                <w:color w:val="000000"/>
+                <w:sz w:val="15"/>
               </w:rPr>
               <w:t>-</w:t>
             </w:r>
@@ -13644,17 +13505,16 @@
           </w:tcPr>
           <w:p>
             <w:pPr>
-              <w:pStyle w:val="affd"/>
-              <w:spacing w:before="0" w:after="0" w:line="276" w:lineRule="auto"/>
-              <w:jc w:val="center"/>
-            </w:pPr>
-            <w:r/>
-            <w:r>
-              <w:rPr>
-                <w:rFonts w:ascii="Times New Roman" w:hAnsi="Times New Roman" w:eastAsia="KaiTi"/>
-                <w:b w:val="0"/>
-                <w:color w:val="000000"/>
-                <w:sz w:val="16"/>
+              <w:spacing w:before="0" w:after="0" w:line="276" w:lineRule="auto"/>
+              <w:jc w:val="center"/>
+            </w:pPr>
+            <w:r/>
+            <w:r>
+              <w:rPr>
+                <w:rFonts w:ascii="Times New Roman" w:hAnsi="Times New Roman" w:eastAsia="KaiTi"/>
+                <w:b w:val="0"/>
+                <w:color w:val="000000"/>
+                <w:sz w:val="15"/>
               </w:rPr>
               <w:t>17</w:t>
             </w:r>
@@ -13669,17 +13529,16 @@
           </w:tcPr>
           <w:p>
             <w:pPr>
-              <w:pStyle w:val="affd"/>
-              <w:spacing w:before="0" w:after="0" w:line="276" w:lineRule="auto"/>
-              <w:jc w:val="center"/>
-            </w:pPr>
-            <w:r/>
-            <w:r>
-              <w:rPr>
-                <w:rFonts w:ascii="Times New Roman" w:hAnsi="Times New Roman" w:eastAsia="KaiTi"/>
-                <w:b w:val="0"/>
-                <w:color w:val="000000"/>
-                <w:sz w:val="16"/>
+              <w:spacing w:before="0" w:after="0" w:line="276" w:lineRule="auto"/>
+              <w:jc w:val="center"/>
+            </w:pPr>
+            <w:r/>
+            <w:r>
+              <w:rPr>
+                <w:rFonts w:ascii="Times New Roman" w:hAnsi="Times New Roman" w:eastAsia="KaiTi"/>
+                <w:b w:val="0"/>
+                <w:color w:val="000000"/>
+                <w:sz w:val="15"/>
               </w:rPr>
               <w:t>2021</w:t>
             </w:r>
@@ -13692,17 +13551,16 @@
           </w:tcPr>
           <w:p>
             <w:pPr>
-              <w:pStyle w:val="affd"/>
-              <w:spacing w:before="0" w:after="0" w:line="276" w:lineRule="auto"/>
-              <w:jc w:val="center"/>
-            </w:pPr>
-            <w:r/>
-            <w:r>
-              <w:rPr>
-                <w:rFonts w:ascii="Times New Roman" w:hAnsi="Times New Roman" w:eastAsia="KaiTi"/>
-                <w:b w:val="0"/>
-                <w:color w:val="000000"/>
-                <w:sz w:val="16"/>
+              <w:spacing w:before="0" w:after="0" w:line="276" w:lineRule="auto"/>
+              <w:jc w:val="center"/>
+            </w:pPr>
+            <w:r/>
+            <w:r>
+              <w:rPr>
+                <w:rFonts w:ascii="Times New Roman" w:hAnsi="Times New Roman" w:eastAsia="KaiTi"/>
+                <w:b w:val="0"/>
+                <w:color w:val="000000"/>
+                <w:sz w:val="15"/>
               </w:rPr>
               <w:t>-</w:t>
             </w:r>
@@ -13715,17 +13573,16 @@
           </w:tcPr>
           <w:p>
             <w:pPr>
-              <w:pStyle w:val="affd"/>
-              <w:spacing w:before="0" w:after="0" w:line="276" w:lineRule="auto"/>
-              <w:jc w:val="center"/>
-            </w:pPr>
-            <w:r/>
-            <w:r>
-              <w:rPr>
-                <w:rFonts w:ascii="Times New Roman" w:hAnsi="Times New Roman" w:eastAsia="KaiTi"/>
-                <w:b w:val="0"/>
-                <w:color w:val="000000"/>
-                <w:sz w:val="16"/>
+              <w:spacing w:before="0" w:after="0" w:line="276" w:lineRule="auto"/>
+              <w:jc w:val="center"/>
+            </w:pPr>
+            <w:r/>
+            <w:r>
+              <w:rPr>
+                <w:rFonts w:ascii="Times New Roman" w:hAnsi="Times New Roman" w:eastAsia="KaiTi"/>
+                <w:b w:val="0"/>
+                <w:color w:val="000000"/>
+                <w:sz w:val="15"/>
               </w:rPr>
               <w:t>18</w:t>
             </w:r>
@@ -13738,17 +13595,16 @@
           </w:tcPr>
           <w:p>
             <w:pPr>
-              <w:pStyle w:val="affd"/>
-              <w:spacing w:before="0" w:after="0" w:line="276" w:lineRule="auto"/>
-              <w:jc w:val="center"/>
-            </w:pPr>
-            <w:r/>
-            <w:r>
-              <w:rPr>
-                <w:rFonts w:ascii="Times New Roman" w:hAnsi="Times New Roman" w:eastAsia="KaiTi"/>
-                <w:b w:val="0"/>
-                <w:color w:val="000000"/>
-                <w:sz w:val="16"/>
+              <w:spacing w:before="0" w:after="0" w:line="276" w:lineRule="auto"/>
+              <w:jc w:val="center"/>
+            </w:pPr>
+            <w:r/>
+            <w:r>
+              <w:rPr>
+                <w:rFonts w:ascii="Times New Roman" w:hAnsi="Times New Roman" w:eastAsia="KaiTi"/>
+                <w:b w:val="0"/>
+                <w:color w:val="000000"/>
+                <w:sz w:val="15"/>
               </w:rPr>
               <w:t>-</w:t>
             </w:r>
@@ -13761,17 +13617,16 @@
           </w:tcPr>
           <w:p>
             <w:pPr>
-              <w:pStyle w:val="affd"/>
-              <w:spacing w:before="0" w:after="0" w:line="276" w:lineRule="auto"/>
-              <w:jc w:val="center"/>
-            </w:pPr>
-            <w:r/>
-            <w:r>
-              <w:rPr>
-                <w:rFonts w:ascii="Times New Roman" w:hAnsi="Times New Roman" w:eastAsia="KaiTi"/>
-                <w:b w:val="0"/>
-                <w:color w:val="000000"/>
-                <w:sz w:val="16"/>
+              <w:spacing w:before="0" w:after="0" w:line="276" w:lineRule="auto"/>
+              <w:jc w:val="center"/>
+            </w:pPr>
+            <w:r/>
+            <w:r>
+              <w:rPr>
+                <w:rFonts w:ascii="Times New Roman" w:hAnsi="Times New Roman" w:eastAsia="KaiTi"/>
+                <w:b w:val="0"/>
+                <w:color w:val="000000"/>
+                <w:sz w:val="15"/>
               </w:rPr>
               <w:t>18</w:t>
             </w:r>
@@ -13786,17 +13641,16 @@
           </w:tcPr>
           <w:p>
             <w:pPr>
-              <w:pStyle w:val="affd"/>
-              <w:spacing w:before="0" w:after="0" w:line="276" w:lineRule="auto"/>
-              <w:jc w:val="center"/>
-            </w:pPr>
-            <w:r/>
-            <w:r>
-              <w:rPr>
-                <w:rFonts w:ascii="Times New Roman" w:hAnsi="Times New Roman" w:eastAsia="KaiTi"/>
-                <w:b w:val="0"/>
-                <w:color w:val="000000"/>
-                <w:sz w:val="16"/>
+              <w:spacing w:before="0" w:after="0" w:line="276" w:lineRule="auto"/>
+              <w:jc w:val="center"/>
+            </w:pPr>
+            <w:r/>
+            <w:r>
+              <w:rPr>
+                <w:rFonts w:ascii="Times New Roman" w:hAnsi="Times New Roman" w:eastAsia="KaiTi"/>
+                <w:b w:val="0"/>
+                <w:color w:val="000000"/>
+                <w:sz w:val="15"/>
               </w:rPr>
               <w:t>2022</w:t>
             </w:r>
@@ -13809,17 +13663,16 @@
           </w:tcPr>
           <w:p>
             <w:pPr>
-              <w:pStyle w:val="affd"/>
-              <w:spacing w:before="0" w:after="0" w:line="276" w:lineRule="auto"/>
-              <w:jc w:val="center"/>
-            </w:pPr>
-            <w:r/>
-            <w:r>
-              <w:rPr>
-                <w:rFonts w:ascii="Times New Roman" w:hAnsi="Times New Roman" w:eastAsia="KaiTi"/>
-                <w:b w:val="0"/>
-                <w:color w:val="000000"/>
-                <w:sz w:val="16"/>
+              <w:spacing w:before="0" w:after="0" w:line="276" w:lineRule="auto"/>
+              <w:jc w:val="center"/>
+            </w:pPr>
+            <w:r/>
+            <w:r>
+              <w:rPr>
+                <w:rFonts w:ascii="Times New Roman" w:hAnsi="Times New Roman" w:eastAsia="KaiTi"/>
+                <w:b w:val="0"/>
+                <w:color w:val="000000"/>
+                <w:sz w:val="15"/>
               </w:rPr>
               <w:t>1</w:t>
             </w:r>
@@ -13832,17 +13685,16 @@
           </w:tcPr>
           <w:p>
             <w:pPr>
-              <w:pStyle w:val="affd"/>
-              <w:spacing w:before="0" w:after="0" w:line="276" w:lineRule="auto"/>
-              <w:jc w:val="center"/>
-            </w:pPr>
-            <w:r/>
-            <w:r>
-              <w:rPr>
-                <w:rFonts w:ascii="Times New Roman" w:hAnsi="Times New Roman" w:eastAsia="KaiTi"/>
-                <w:b w:val="0"/>
-                <w:color w:val="000000"/>
-                <w:sz w:val="16"/>
+              <w:spacing w:before="0" w:after="0" w:line="276" w:lineRule="auto"/>
+              <w:jc w:val="center"/>
+            </w:pPr>
+            <w:r/>
+            <w:r>
+              <w:rPr>
+                <w:rFonts w:ascii="Times New Roman" w:hAnsi="Times New Roman" w:eastAsia="KaiTi"/>
+                <w:b w:val="0"/>
+                <w:color w:val="000000"/>
+                <w:sz w:val="15"/>
               </w:rPr>
               <w:t>2</w:t>
             </w:r>
@@ -13855,17 +13707,16 @@
           </w:tcPr>
           <w:p>
             <w:pPr>
-              <w:pStyle w:val="affd"/>
-              <w:spacing w:before="0" w:after="0" w:line="276" w:lineRule="auto"/>
-              <w:jc w:val="center"/>
-            </w:pPr>
-            <w:r/>
-            <w:r>
-              <w:rPr>
-                <w:rFonts w:ascii="Times New Roman" w:hAnsi="Times New Roman" w:eastAsia="KaiTi"/>
-                <w:b w:val="0"/>
-                <w:color w:val="000000"/>
-                <w:sz w:val="16"/>
+              <w:spacing w:before="0" w:after="0" w:line="276" w:lineRule="auto"/>
+              <w:jc w:val="center"/>
+            </w:pPr>
+            <w:r/>
+            <w:r>
+              <w:rPr>
+                <w:rFonts w:ascii="Times New Roman" w:hAnsi="Times New Roman" w:eastAsia="KaiTi"/>
+                <w:b w:val="0"/>
+                <w:color w:val="000000"/>
+                <w:sz w:val="15"/>
               </w:rPr>
               <w:t>-</w:t>
             </w:r>
@@ -13878,17 +13729,16 @@
           </w:tcPr>
           <w:p>
             <w:pPr>
-              <w:pStyle w:val="affd"/>
-              <w:spacing w:before="0" w:after="0" w:line="276" w:lineRule="auto"/>
-              <w:jc w:val="center"/>
-            </w:pPr>
-            <w:r/>
-            <w:r>
-              <w:rPr>
-                <w:rFonts w:ascii="Times New Roman" w:hAnsi="Times New Roman" w:eastAsia="KaiTi"/>
-                <w:b w:val="0"/>
-                <w:color w:val="000000"/>
-                <w:sz w:val="16"/>
+              <w:spacing w:before="0" w:after="0" w:line="276" w:lineRule="auto"/>
+              <w:jc w:val="center"/>
+            </w:pPr>
+            <w:r/>
+            <w:r>
+              <w:rPr>
+                <w:rFonts w:ascii="Times New Roman" w:hAnsi="Times New Roman" w:eastAsia="KaiTi"/>
+                <w:b w:val="0"/>
+                <w:color w:val="000000"/>
+                <w:sz w:val="15"/>
               </w:rPr>
               <w:t>3</w:t>
             </w:r>
@@ -13903,17 +13753,16 @@
           </w:tcPr>
           <w:p>
             <w:pPr>
-              <w:pStyle w:val="affd"/>
-              <w:spacing w:before="0" w:after="0" w:line="276" w:lineRule="auto"/>
-              <w:jc w:val="center"/>
-            </w:pPr>
-            <w:r/>
-            <w:r>
-              <w:rPr>
-                <w:rFonts w:ascii="Times New Roman" w:hAnsi="Times New Roman" w:eastAsia="KaiTi"/>
-                <w:b w:val="0"/>
-                <w:color w:val="000000"/>
-                <w:sz w:val="16"/>
+              <w:spacing w:before="0" w:after="0" w:line="276" w:lineRule="auto"/>
+              <w:jc w:val="center"/>
+            </w:pPr>
+            <w:r/>
+            <w:r>
+              <w:rPr>
+                <w:rFonts w:ascii="Times New Roman" w:hAnsi="Times New Roman" w:eastAsia="KaiTi"/>
+                <w:b w:val="0"/>
+                <w:color w:val="000000"/>
+                <w:sz w:val="15"/>
               </w:rPr>
               <w:t>2023</w:t>
             </w:r>
@@ -13926,17 +13775,16 @@
           </w:tcPr>
           <w:p>
             <w:pPr>
-              <w:pStyle w:val="affd"/>
-              <w:spacing w:before="0" w:after="0" w:line="276" w:lineRule="auto"/>
-              <w:jc w:val="center"/>
-            </w:pPr>
-            <w:r/>
-            <w:r>
-              <w:rPr>
-                <w:rFonts w:ascii="Times New Roman" w:hAnsi="Times New Roman" w:eastAsia="KaiTi"/>
-                <w:b w:val="0"/>
-                <w:color w:val="000000"/>
-                <w:sz w:val="16"/>
+              <w:spacing w:before="0" w:after="0" w:line="276" w:lineRule="auto"/>
+              <w:jc w:val="center"/>
+            </w:pPr>
+            <w:r/>
+            <w:r>
+              <w:rPr>
+                <w:rFonts w:ascii="Times New Roman" w:hAnsi="Times New Roman" w:eastAsia="KaiTi"/>
+                <w:b w:val="0"/>
+                <w:color w:val="000000"/>
+                <w:sz w:val="15"/>
               </w:rPr>
               <w:t>3</w:t>
             </w:r>
@@ -13949,19 +13797,18 @@
           </w:tcPr>
           <w:p>
             <w:pPr>
-              <w:pStyle w:val="affd"/>
-              <w:spacing w:before="0" w:after="0" w:line="276" w:lineRule="auto"/>
-              <w:jc w:val="center"/>
-            </w:pPr>
-            <w:r/>
-            <w:r>
-              <w:rPr>
-                <w:rFonts w:ascii="Times New Roman" w:hAnsi="Times New Roman" w:eastAsia="KaiTi"/>
-                <w:b w:val="0"/>
-                <w:color w:val="000000"/>
-                <w:sz w:val="16"/>
-              </w:rPr>
-              <w:t>23</w:t>
+              <w:spacing w:before="0" w:after="0" w:line="276" w:lineRule="auto"/>
+              <w:jc w:val="center"/>
+            </w:pPr>
+            <w:r/>
+            <w:r>
+              <w:rPr>
+                <w:rFonts w:ascii="Times New Roman" w:hAnsi="Times New Roman" w:eastAsia="KaiTi"/>
+                <w:b w:val="0"/>
+                <w:color w:val="000000"/>
+                <w:sz w:val="15"/>
+              </w:rPr>
+              <w:t>25</w:t>
             </w:r>
           </w:p>
         </w:tc>
@@ -13972,17 +13819,16 @@
           </w:tcPr>
           <w:p>
             <w:pPr>
-              <w:pStyle w:val="affd"/>
-              <w:spacing w:before="0" w:after="0" w:line="276" w:lineRule="auto"/>
-              <w:jc w:val="center"/>
-            </w:pPr>
-            <w:r/>
-            <w:r>
-              <w:rPr>
-                <w:rFonts w:ascii="Times New Roman" w:hAnsi="Times New Roman" w:eastAsia="KaiTi"/>
-                <w:b w:val="0"/>
-                <w:color w:val="000000"/>
-                <w:sz w:val="16"/>
+              <w:spacing w:before="0" w:after="0" w:line="276" w:lineRule="auto"/>
+              <w:jc w:val="center"/>
+            </w:pPr>
+            <w:r/>
+            <w:r>
+              <w:rPr>
+                <w:rFonts w:ascii="Times New Roman" w:hAnsi="Times New Roman" w:eastAsia="KaiTi"/>
+                <w:b w:val="0"/>
+                <w:color w:val="000000"/>
+                <w:sz w:val="15"/>
               </w:rPr>
               <w:t>1</w:t>
             </w:r>
@@ -13995,19 +13841,18 @@
           </w:tcPr>
           <w:p>
             <w:pPr>
-              <w:pStyle w:val="affd"/>
-              <w:spacing w:before="0" w:after="0" w:line="276" w:lineRule="auto"/>
-              <w:jc w:val="center"/>
-            </w:pPr>
-            <w:r/>
-            <w:r>
-              <w:rPr>
-                <w:rFonts w:ascii="Times New Roman" w:hAnsi="Times New Roman" w:eastAsia="KaiTi"/>
-                <w:b w:val="0"/>
-                <w:color w:val="000000"/>
-                <w:sz w:val="16"/>
-              </w:rPr>
-              <w:t>27</w:t>
+              <w:spacing w:before="0" w:after="0" w:line="276" w:lineRule="auto"/>
+              <w:jc w:val="center"/>
+            </w:pPr>
+            <w:r/>
+            <w:r>
+              <w:rPr>
+                <w:rFonts w:ascii="Times New Roman" w:hAnsi="Times New Roman" w:eastAsia="KaiTi"/>
+                <w:b w:val="0"/>
+                <w:color w:val="000000"/>
+                <w:sz w:val="15"/>
+              </w:rPr>
+              <w:t>29</w:t>
             </w:r>
           </w:p>
         </w:tc>
@@ -14020,17 +13865,16 @@
           </w:tcPr>
           <w:p>
             <w:pPr>
-              <w:pStyle w:val="affd"/>
-              <w:spacing w:before="0" w:after="0" w:line="276" w:lineRule="auto"/>
-              <w:jc w:val="center"/>
-            </w:pPr>
-            <w:r/>
-            <w:r>
-              <w:rPr>
-                <w:rFonts w:ascii="Times New Roman" w:hAnsi="Times New Roman" w:eastAsia="KaiTi"/>
-                <w:b w:val="0"/>
-                <w:color w:val="000000"/>
-                <w:sz w:val="16"/>
+              <w:spacing w:before="0" w:after="0" w:line="276" w:lineRule="auto"/>
+              <w:jc w:val="center"/>
+            </w:pPr>
+            <w:r/>
+            <w:r>
+              <w:rPr>
+                <w:rFonts w:ascii="Times New Roman" w:hAnsi="Times New Roman" w:eastAsia="KaiTi"/>
+                <w:b w:val="0"/>
+                <w:color w:val="000000"/>
+                <w:sz w:val="15"/>
               </w:rPr>
               <w:t>2024</w:t>
             </w:r>
@@ -14043,17 +13887,16 @@
           </w:tcPr>
           <w:p>
             <w:pPr>
-              <w:pStyle w:val="affd"/>
-              <w:spacing w:before="0" w:after="0" w:line="276" w:lineRule="auto"/>
-              <w:jc w:val="center"/>
-            </w:pPr>
-            <w:r/>
-            <w:r>
-              <w:rPr>
-                <w:rFonts w:ascii="Times New Roman" w:hAnsi="Times New Roman" w:eastAsia="KaiTi"/>
-                <w:b w:val="0"/>
-                <w:color w:val="000000"/>
-                <w:sz w:val="16"/>
+              <w:spacing w:before="0" w:after="0" w:line="276" w:lineRule="auto"/>
+              <w:jc w:val="center"/>
+            </w:pPr>
+            <w:r/>
+            <w:r>
+              <w:rPr>
+                <w:rFonts w:ascii="Times New Roman" w:hAnsi="Times New Roman" w:eastAsia="KaiTi"/>
+                <w:b w:val="0"/>
+                <w:color w:val="000000"/>
+                <w:sz w:val="15"/>
               </w:rPr>
               <w:t>1</w:t>
             </w:r>
@@ -14066,19 +13909,18 @@
           </w:tcPr>
           <w:p>
             <w:pPr>
-              <w:pStyle w:val="affd"/>
-              <w:spacing w:before="0" w:after="0" w:line="276" w:lineRule="auto"/>
-              <w:jc w:val="center"/>
-            </w:pPr>
-            <w:r/>
-            <w:r>
-              <w:rPr>
-                <w:rFonts w:ascii="Times New Roman" w:hAnsi="Times New Roman" w:eastAsia="KaiTi"/>
-                <w:b w:val="0"/>
-                <w:color w:val="000000"/>
-                <w:sz w:val="16"/>
-              </w:rPr>
-              <w:t>34</w:t>
+              <w:spacing w:before="0" w:after="0" w:line="276" w:lineRule="auto"/>
+              <w:jc w:val="center"/>
+            </w:pPr>
+            <w:r/>
+            <w:r>
+              <w:rPr>
+                <w:rFonts w:ascii="Times New Roman" w:hAnsi="Times New Roman" w:eastAsia="KaiTi"/>
+                <w:b w:val="0"/>
+                <w:color w:val="000000"/>
+                <w:sz w:val="15"/>
+              </w:rPr>
+              <w:t>36</w:t>
             </w:r>
           </w:p>
         </w:tc>
@@ -14089,17 +13931,16 @@
           </w:tcPr>
           <w:p>
             <w:pPr>
-              <w:pStyle w:val="affd"/>
-              <w:spacing w:before="0" w:after="0" w:line="276" w:lineRule="auto"/>
-              <w:jc w:val="center"/>
-            </w:pPr>
-            <w:r/>
-            <w:r>
-              <w:rPr>
-                <w:rFonts w:ascii="Times New Roman" w:hAnsi="Times New Roman" w:eastAsia="KaiTi"/>
-                <w:b w:val="0"/>
-                <w:color w:val="000000"/>
-                <w:sz w:val="16"/>
+              <w:spacing w:before="0" w:after="0" w:line="276" w:lineRule="auto"/>
+              <w:jc w:val="center"/>
+            </w:pPr>
+            <w:r/>
+            <w:r>
+              <w:rPr>
+                <w:rFonts w:ascii="Times New Roman" w:hAnsi="Times New Roman" w:eastAsia="KaiTi"/>
+                <w:b w:val="0"/>
+                <w:color w:val="000000"/>
+                <w:sz w:val="15"/>
               </w:rPr>
               <w:t>-</w:t>
             </w:r>
@@ -14112,19 +13953,18 @@
           </w:tcPr>
           <w:p>
             <w:pPr>
-              <w:pStyle w:val="affd"/>
-              <w:spacing w:before="0" w:after="0" w:line="276" w:lineRule="auto"/>
-              <w:jc w:val="center"/>
-            </w:pPr>
-            <w:r/>
-            <w:r>
-              <w:rPr>
-                <w:rFonts w:ascii="Times New Roman" w:hAnsi="Times New Roman" w:eastAsia="KaiTi"/>
-                <w:b w:val="0"/>
-                <w:color w:val="000000"/>
-                <w:sz w:val="16"/>
-              </w:rPr>
-              <w:t>35</w:t>
+              <w:spacing w:before="0" w:after="0" w:line="276" w:lineRule="auto"/>
+              <w:jc w:val="center"/>
+            </w:pPr>
+            <w:r/>
+            <w:r>
+              <w:rPr>
+                <w:rFonts w:ascii="Times New Roman" w:hAnsi="Times New Roman" w:eastAsia="KaiTi"/>
+                <w:b w:val="0"/>
+                <w:color w:val="000000"/>
+                <w:sz w:val="15"/>
+              </w:rPr>
+              <w:t>37</w:t>
             </w:r>
           </w:p>
         </w:tc>
@@ -14137,17 +13977,16 @@
           </w:tcPr>
           <w:p>
             <w:pPr>
-              <w:pStyle w:val="affd"/>
-              <w:spacing w:before="0" w:after="0" w:line="276" w:lineRule="auto"/>
-              <w:jc w:val="center"/>
-            </w:pPr>
-            <w:r/>
-            <w:r>
-              <w:rPr>
-                <w:rFonts w:ascii="Times New Roman" w:hAnsi="Times New Roman" w:eastAsia="KaiTi"/>
-                <w:b w:val="0"/>
-                <w:color w:val="000000"/>
-                <w:sz w:val="16"/>
+              <w:spacing w:before="0" w:after="0" w:line="276" w:lineRule="auto"/>
+              <w:jc w:val="center"/>
+            </w:pPr>
+            <w:r/>
+            <w:r>
+              <w:rPr>
+                <w:rFonts w:ascii="Times New Roman" w:hAnsi="Times New Roman" w:eastAsia="KaiTi"/>
+                <w:b w:val="0"/>
+                <w:color w:val="000000"/>
+                <w:sz w:val="15"/>
               </w:rPr>
               <w:t>2025</w:t>
             </w:r>
@@ -14160,17 +13999,16 @@
           </w:tcPr>
           <w:p>
             <w:pPr>
-              <w:pStyle w:val="affd"/>
-              <w:spacing w:before="0" w:after="0" w:line="276" w:lineRule="auto"/>
-              <w:jc w:val="center"/>
-            </w:pPr>
-            <w:r/>
-            <w:r>
-              <w:rPr>
-                <w:rFonts w:ascii="Times New Roman" w:hAnsi="Times New Roman" w:eastAsia="KaiTi"/>
-                <w:b w:val="0"/>
-                <w:color w:val="000000"/>
-                <w:sz w:val="16"/>
+              <w:spacing w:before="0" w:after="0" w:line="276" w:lineRule="auto"/>
+              <w:jc w:val="center"/>
+            </w:pPr>
+            <w:r/>
+            <w:r>
+              <w:rPr>
+                <w:rFonts w:ascii="Times New Roman" w:hAnsi="Times New Roman" w:eastAsia="KaiTi"/>
+                <w:b w:val="0"/>
+                <w:color w:val="000000"/>
+                <w:sz w:val="15"/>
               </w:rPr>
               <w:t>5</w:t>
             </w:r>
@@ -14183,19 +14021,18 @@
           </w:tcPr>
           <w:p>
             <w:pPr>
-              <w:pStyle w:val="affd"/>
-              <w:spacing w:before="0" w:after="0" w:line="276" w:lineRule="auto"/>
-              <w:jc w:val="center"/>
-            </w:pPr>
-            <w:r/>
-            <w:r>
-              <w:rPr>
-                <w:rFonts w:ascii="Times New Roman" w:hAnsi="Times New Roman" w:eastAsia="KaiTi"/>
-                <w:b w:val="0"/>
-                <w:color w:val="000000"/>
-                <w:sz w:val="16"/>
-              </w:rPr>
-              <w:t>18</w:t>
+              <w:spacing w:before="0" w:after="0" w:line="276" w:lineRule="auto"/>
+              <w:jc w:val="center"/>
+            </w:pPr>
+            <w:r/>
+            <w:r>
+              <w:rPr>
+                <w:rFonts w:ascii="Times New Roman" w:hAnsi="Times New Roman" w:eastAsia="KaiTi"/>
+                <w:b w:val="0"/>
+                <w:color w:val="000000"/>
+                <w:sz w:val="15"/>
+              </w:rPr>
+              <w:t>25</w:t>
             </w:r>
           </w:p>
         </w:tc>
@@ -14206,17 +14043,16 @@
           </w:tcPr>
           <w:p>
             <w:pPr>
-              <w:pStyle w:val="affd"/>
-              <w:spacing w:before="0" w:after="0" w:line="276" w:lineRule="auto"/>
-              <w:jc w:val="center"/>
-            </w:pPr>
-            <w:r/>
-            <w:r>
-              <w:rPr>
-                <w:rFonts w:ascii="Times New Roman" w:hAnsi="Times New Roman" w:eastAsia="KaiTi"/>
-                <w:b w:val="0"/>
-                <w:color w:val="000000"/>
-                <w:sz w:val="16"/>
+              <w:spacing w:before="0" w:after="0" w:line="276" w:lineRule="auto"/>
+              <w:jc w:val="center"/>
+            </w:pPr>
+            <w:r/>
+            <w:r>
+              <w:rPr>
+                <w:rFonts w:ascii="Times New Roman" w:hAnsi="Times New Roman" w:eastAsia="KaiTi"/>
+                <w:b w:val="0"/>
+                <w:color w:val="000000"/>
+                <w:sz w:val="15"/>
               </w:rPr>
               <w:t>-</w:t>
             </w:r>
@@ -14229,19 +14065,18 @@
           </w:tcPr>
           <w:p>
             <w:pPr>
-              <w:pStyle w:val="affd"/>
-              <w:spacing w:before="0" w:after="0" w:line="276" w:lineRule="auto"/>
-              <w:jc w:val="center"/>
-            </w:pPr>
-            <w:r/>
-            <w:r>
-              <w:rPr>
-                <w:rFonts w:ascii="Times New Roman" w:hAnsi="Times New Roman" w:eastAsia="KaiTi"/>
-                <w:b w:val="0"/>
-                <w:color w:val="000000"/>
-                <w:sz w:val="16"/>
-              </w:rPr>
-              <w:t>23</w:t>
+              <w:spacing w:before="0" w:after="0" w:line="276" w:lineRule="auto"/>
+              <w:jc w:val="center"/>
+            </w:pPr>
+            <w:r/>
+            <w:r>
+              <w:rPr>
+                <w:rFonts w:ascii="Times New Roman" w:hAnsi="Times New Roman" w:eastAsia="KaiTi"/>
+                <w:b w:val="0"/>
+                <w:color w:val="000000"/>
+                <w:sz w:val="15"/>
+              </w:rPr>
+              <w:t>30</w:t>
             </w:r>
           </w:p>
         </w:tc>
@@ -14254,17 +14089,16 @@
           </w:tcPr>
           <w:p>
             <w:pPr>
-              <w:pStyle w:val="affd"/>
-              <w:spacing w:before="0" w:after="0" w:line="276" w:lineRule="auto"/>
-              <w:jc w:val="center"/>
-            </w:pPr>
-            <w:r/>
-            <w:r>
-              <w:rPr>
-                <w:rFonts w:ascii="Times New Roman" w:hAnsi="Times New Roman" w:eastAsia="KaiTi"/>
-                <w:b w:val="0"/>
-                <w:color w:val="000000"/>
-                <w:sz w:val="16"/>
+              <w:spacing w:before="0" w:after="0" w:line="276" w:lineRule="auto"/>
+              <w:jc w:val="center"/>
+            </w:pPr>
+            <w:r/>
+            <w:r>
+              <w:rPr>
+                <w:rFonts w:ascii="Times New Roman" w:hAnsi="Times New Roman" w:eastAsia="KaiTi"/>
+                <w:b w:val="0"/>
+                <w:color w:val="000000"/>
+                <w:sz w:val="15"/>
               </w:rPr>
               <w:t>2026</w:t>
             </w:r>
@@ -14277,17 +14111,16 @@
           </w:tcPr>
           <w:p>
             <w:pPr>
-              <w:pStyle w:val="affd"/>
-              <w:spacing w:before="0" w:after="0" w:line="276" w:lineRule="auto"/>
-              <w:jc w:val="center"/>
-            </w:pPr>
-            <w:r/>
-            <w:r>
-              <w:rPr>
-                <w:rFonts w:ascii="Times New Roman" w:hAnsi="Times New Roman" w:eastAsia="KaiTi"/>
-                <w:b w:val="0"/>
-                <w:color w:val="000000"/>
-                <w:sz w:val="16"/>
+              <w:spacing w:before="0" w:after="0" w:line="276" w:lineRule="auto"/>
+              <w:jc w:val="center"/>
+            </w:pPr>
+            <w:r/>
+            <w:r>
+              <w:rPr>
+                <w:rFonts w:ascii="Times New Roman" w:hAnsi="Times New Roman" w:eastAsia="KaiTi"/>
+                <w:b w:val="0"/>
+                <w:color w:val="000000"/>
+                <w:sz w:val="15"/>
               </w:rPr>
               <w:t>2</w:t>
             </w:r>
@@ -14300,19 +14133,18 @@
           </w:tcPr>
           <w:p>
             <w:pPr>
-              <w:pStyle w:val="affd"/>
-              <w:spacing w:before="0" w:after="0" w:line="276" w:lineRule="auto"/>
-              <w:jc w:val="center"/>
-            </w:pPr>
-            <w:r/>
-            <w:r>
-              <w:rPr>
-                <w:rFonts w:ascii="Times New Roman" w:hAnsi="Times New Roman" w:eastAsia="KaiTi"/>
-                <w:b w:val="0"/>
-                <w:color w:val="000000"/>
-                <w:sz w:val="16"/>
-              </w:rPr>
-              <w:t>8</w:t>
+              <w:spacing w:before="0" w:after="0" w:line="276" w:lineRule="auto"/>
+              <w:jc w:val="center"/>
+            </w:pPr>
+            <w:r/>
+            <w:r>
+              <w:rPr>
+                <w:rFonts w:ascii="Times New Roman" w:hAnsi="Times New Roman" w:eastAsia="KaiTi"/>
+                <w:b w:val="0"/>
+                <w:color w:val="000000"/>
+                <w:sz w:val="15"/>
+              </w:rPr>
+              <w:t>9</w:t>
             </w:r>
           </w:p>
         </w:tc>
@@ -14323,17 +14155,16 @@
           </w:tcPr>
           <w:p>
             <w:pPr>
-              <w:pStyle w:val="affd"/>
-              <w:spacing w:before="0" w:after="0" w:line="276" w:lineRule="auto"/>
-              <w:jc w:val="center"/>
-            </w:pPr>
-            <w:r/>
-            <w:r>
-              <w:rPr>
-                <w:rFonts w:ascii="Times New Roman" w:hAnsi="Times New Roman" w:eastAsia="KaiTi"/>
-                <w:b w:val="0"/>
-                <w:color w:val="000000"/>
-                <w:sz w:val="16"/>
+              <w:spacing w:before="0" w:after="0" w:line="276" w:lineRule="auto"/>
+              <w:jc w:val="center"/>
+            </w:pPr>
+            <w:r/>
+            <w:r>
+              <w:rPr>
+                <w:rFonts w:ascii="Times New Roman" w:hAnsi="Times New Roman" w:eastAsia="KaiTi"/>
+                <w:b w:val="0"/>
+                <w:color w:val="000000"/>
+                <w:sz w:val="15"/>
               </w:rPr>
               <w:t>-</w:t>
             </w:r>
@@ -14346,19 +14177,18 @@
           </w:tcPr>
           <w:p>
             <w:pPr>
-              <w:pStyle w:val="affd"/>
-              <w:spacing w:before="0" w:after="0" w:line="276" w:lineRule="auto"/>
-              <w:jc w:val="center"/>
-            </w:pPr>
-            <w:r/>
-            <w:r>
-              <w:rPr>
-                <w:rFonts w:ascii="Times New Roman" w:hAnsi="Times New Roman" w:eastAsia="KaiTi"/>
-                <w:b w:val="0"/>
-                <w:color w:val="000000"/>
-                <w:sz w:val="16"/>
-              </w:rPr>
-              <w:t>10</w:t>
+              <w:spacing w:before="0" w:after="0" w:line="276" w:lineRule="auto"/>
+              <w:jc w:val="center"/>
+            </w:pPr>
+            <w:r/>
+            <w:r>
+              <w:rPr>
+                <w:rFonts w:ascii="Times New Roman" w:hAnsi="Times New Roman" w:eastAsia="KaiTi"/>
+                <w:b w:val="0"/>
+                <w:color w:val="000000"/>
+                <w:sz w:val="15"/>
+              </w:rPr>
+              <w:t>11</w:t>
             </w:r>
           </w:p>
         </w:tc>
@@ -14390,7 +14220,7 @@
           <w:color w:val="000000"/>
           <w:sz w:val="22"/>
         </w:rPr>
-        <w:t>从发行节奏看，2011-2011年为早期布局阶段，共发行1只产品，以收益增强1只为主；2014-2024年为集中扩张阶段，共发行108只，以风险缓冲98只、收益增强8只为主；2025-2026年发行33只，以风险缓冲26只、收益增强7只为主。2020-2021年为其Buffer产品集中扩张期，此后持续填充不同月份和缓冲深度的产品缺口。</w:t>
+        <w:t>从发行节奏看，2011年为早期布局阶段，共发行1只产品，以收益增强1只为主；2014-2024年为集中扩张阶段，共发行112只，以风险缓冲102只、收益增强8只，另有另类策略2只；2025-2026年发行41只，以风险缓冲34只、收益增强7只为主。2020-2021年为其Buffer产品集中扩张期，此后持续填充不同月份和缓冲深度的产品缺口。</w:t>
       </w:r>
     </w:p>
     <w:p>
@@ -14439,7 +14269,6 @@
           </w:tcPr>
           <w:p>
             <w:pPr>
-              <w:pStyle w:val="affd"/>
               <w:spacing w:before="0" w:after="0" w:line="276" w:lineRule="auto"/>
               <w:jc w:val="center"/>
             </w:pPr>
@@ -14463,7 +14292,6 @@
           </w:tcPr>
           <w:p>
             <w:pPr>
-              <w:pStyle w:val="affd"/>
               <w:spacing w:before="0" w:after="0" w:line="276" w:lineRule="auto"/>
               <w:jc w:val="center"/>
             </w:pPr>
@@ -14487,7 +14315,6 @@
           </w:tcPr>
           <w:p>
             <w:pPr>
-              <w:pStyle w:val="affd"/>
               <w:spacing w:before="0" w:after="0" w:line="276" w:lineRule="auto"/>
               <w:jc w:val="center"/>
             </w:pPr>
@@ -14511,7 +14338,6 @@
           </w:tcPr>
           <w:p>
             <w:pPr>
-              <w:pStyle w:val="affd"/>
               <w:spacing w:before="0" w:after="0" w:line="276" w:lineRule="auto"/>
               <w:jc w:val="center"/>
             </w:pPr>
@@ -14535,7 +14361,6 @@
           </w:tcPr>
           <w:p>
             <w:pPr>
-              <w:pStyle w:val="affd"/>
               <w:spacing w:before="0" w:after="0" w:line="276" w:lineRule="auto"/>
               <w:jc w:val="center"/>
             </w:pPr>
@@ -14560,7 +14385,6 @@
           </w:tcPr>
           <w:p>
             <w:pPr>
-              <w:pStyle w:val="affd"/>
               <w:spacing w:before="0" w:after="0" w:line="276" w:lineRule="auto"/>
               <w:jc w:val="center"/>
             </w:pPr>
@@ -14583,19 +14407,18 @@
           </w:tcPr>
           <w:p>
             <w:pPr>
-              <w:pStyle w:val="affd"/>
-              <w:spacing w:before="0" w:after="0" w:line="276" w:lineRule="auto"/>
-              <w:jc w:val="center"/>
-            </w:pPr>
-            <w:r/>
-            <w:r>
-              <w:rPr>
-                <w:rFonts w:ascii="Times New Roman" w:hAnsi="Times New Roman" w:eastAsia="KaiTi"/>
-                <w:b w:val="0"/>
-                <w:color w:val="000000"/>
-                <w:sz w:val="15"/>
-              </w:rPr>
-              <w:t>+12.60</w:t>
+              <w:spacing w:before="0" w:after="0" w:line="276" w:lineRule="auto"/>
+              <w:jc w:val="center"/>
+            </w:pPr>
+            <w:r/>
+            <w:r>
+              <w:rPr>
+                <w:rFonts w:ascii="Times New Roman" w:hAnsi="Times New Roman" w:eastAsia="KaiTi"/>
+                <w:b w:val="0"/>
+                <w:color w:val="000000"/>
+                <w:sz w:val="15"/>
+              </w:rPr>
+              <w:t>+12.68</w:t>
             </w:r>
           </w:p>
         </w:tc>
@@ -14606,19 +14429,18 @@
           </w:tcPr>
           <w:p>
             <w:pPr>
-              <w:pStyle w:val="affd"/>
-              <w:spacing w:before="0" w:after="0" w:line="276" w:lineRule="auto"/>
-              <w:jc w:val="center"/>
-            </w:pPr>
-            <w:r/>
-            <w:r>
-              <w:rPr>
-                <w:rFonts w:ascii="Times New Roman" w:hAnsi="Times New Roman" w:eastAsia="KaiTi"/>
-                <w:b w:val="0"/>
-                <w:color w:val="000000"/>
-                <w:sz w:val="15"/>
-              </w:rPr>
-              <w:t>流入64只/流出47只</w:t>
+              <w:spacing w:before="0" w:after="0" w:line="276" w:lineRule="auto"/>
+              <w:jc w:val="center"/>
+            </w:pPr>
+            <w:r/>
+            <w:r>
+              <w:rPr>
+                <w:rFonts w:ascii="Times New Roman" w:hAnsi="Times New Roman" w:eastAsia="KaiTi"/>
+                <w:b w:val="0"/>
+                <w:color w:val="000000"/>
+                <w:sz w:val="15"/>
+              </w:rPr>
+              <w:t>流入70只/流出53只</w:t>
             </w:r>
           </w:p>
         </w:tc>
@@ -14629,19 +14451,18 @@
           </w:tcPr>
           <w:p>
             <w:pPr>
-              <w:pStyle w:val="affd"/>
-              <w:spacing w:before="0" w:after="0" w:line="276" w:lineRule="auto"/>
-              <w:jc w:val="center"/>
-            </w:pPr>
-            <w:r/>
-            <w:r>
-              <w:rPr>
-                <w:rFonts w:ascii="Times New Roman" w:hAnsi="Times New Roman" w:eastAsia="KaiTi"/>
-                <w:b w:val="0"/>
-                <w:color w:val="000000"/>
-                <w:sz w:val="15"/>
-              </w:rPr>
-              <w:t>流入合计+16.01亿 / 流出合计-3.41亿</w:t>
+              <w:spacing w:before="0" w:after="0" w:line="276" w:lineRule="auto"/>
+              <w:jc w:val="center"/>
+            </w:pPr>
+            <w:r/>
+            <w:r>
+              <w:rPr>
+                <w:rFonts w:ascii="Times New Roman" w:hAnsi="Times New Roman" w:eastAsia="KaiTi"/>
+                <w:b w:val="0"/>
+                <w:color w:val="000000"/>
+                <w:sz w:val="15"/>
+              </w:rPr>
+              <w:t>流入合计+16.11亿 / 流出合计-3.43亿</w:t>
             </w:r>
           </w:p>
         </w:tc>
@@ -14652,7 +14473,6 @@
           </w:tcPr>
           <w:p>
             <w:pPr>
-              <w:pStyle w:val="affd"/>
               <w:spacing w:before="0" w:after="0" w:line="276" w:lineRule="auto"/>
               <w:jc w:val="center"/>
             </w:pPr>
@@ -14677,7 +14497,6 @@
           </w:tcPr>
           <w:p>
             <w:pPr>
-              <w:pStyle w:val="affd"/>
               <w:spacing w:before="0" w:after="0" w:line="276" w:lineRule="auto"/>
               <w:jc w:val="center"/>
             </w:pPr>
@@ -14700,19 +14519,18 @@
           </w:tcPr>
           <w:p>
             <w:pPr>
-              <w:pStyle w:val="affd"/>
-              <w:spacing w:before="0" w:after="0" w:line="276" w:lineRule="auto"/>
-              <w:jc w:val="center"/>
-            </w:pPr>
-            <w:r/>
-            <w:r>
-              <w:rPr>
-                <w:rFonts w:ascii="Times New Roman" w:hAnsi="Times New Roman" w:eastAsia="KaiTi"/>
-                <w:b w:val="0"/>
-                <w:color w:val="000000"/>
-                <w:sz w:val="15"/>
-              </w:rPr>
-              <w:t>+33.19</w:t>
+              <w:spacing w:before="0" w:after="0" w:line="276" w:lineRule="auto"/>
+              <w:jc w:val="center"/>
+            </w:pPr>
+            <w:r/>
+            <w:r>
+              <w:rPr>
+                <w:rFonts w:ascii="Times New Roman" w:hAnsi="Times New Roman" w:eastAsia="KaiTi"/>
+                <w:b w:val="0"/>
+                <w:color w:val="000000"/>
+                <w:sz w:val="15"/>
+              </w:rPr>
+              <w:t>+33.29</w:t>
             </w:r>
           </w:p>
         </w:tc>
@@ -14723,19 +14541,18 @@
           </w:tcPr>
           <w:p>
             <w:pPr>
-              <w:pStyle w:val="affd"/>
-              <w:spacing w:before="0" w:after="0" w:line="276" w:lineRule="auto"/>
-              <w:jc w:val="center"/>
-            </w:pPr>
-            <w:r/>
-            <w:r>
-              <w:rPr>
-                <w:rFonts w:ascii="Times New Roman" w:hAnsi="Times New Roman" w:eastAsia="KaiTi"/>
-                <w:b w:val="0"/>
-                <w:color w:val="000000"/>
-                <w:sz w:val="15"/>
-              </w:rPr>
-              <w:t>流入82只/流出48只（缺6只）</w:t>
+              <w:spacing w:before="0" w:after="0" w:line="276" w:lineRule="auto"/>
+              <w:jc w:val="center"/>
+            </w:pPr>
+            <w:r/>
+            <w:r>
+              <w:rPr>
+                <w:rFonts w:ascii="Times New Roman" w:hAnsi="Times New Roman" w:eastAsia="KaiTi"/>
+                <w:b w:val="0"/>
+                <w:color w:val="000000"/>
+                <w:sz w:val="15"/>
+              </w:rPr>
+              <w:t>流入89只/流出53只（缺6只）</w:t>
             </w:r>
           </w:p>
         </w:tc>
@@ -14746,19 +14563,18 @@
           </w:tcPr>
           <w:p>
             <w:pPr>
-              <w:pStyle w:val="affd"/>
-              <w:spacing w:before="0" w:after="0" w:line="276" w:lineRule="auto"/>
-              <w:jc w:val="center"/>
-            </w:pPr>
-            <w:r/>
-            <w:r>
-              <w:rPr>
-                <w:rFonts w:ascii="Times New Roman" w:hAnsi="Times New Roman" w:eastAsia="KaiTi"/>
-                <w:b w:val="0"/>
-                <w:color w:val="000000"/>
-                <w:sz w:val="15"/>
-              </w:rPr>
-              <w:t>流入合计+40.28亿 / 流出合计-7.09亿</w:t>
+              <w:spacing w:before="0" w:after="0" w:line="276" w:lineRule="auto"/>
+              <w:jc w:val="center"/>
+            </w:pPr>
+            <w:r/>
+            <w:r>
+              <w:rPr>
+                <w:rFonts w:ascii="Times New Roman" w:hAnsi="Times New Roman" w:eastAsia="KaiTi"/>
+                <w:b w:val="0"/>
+                <w:color w:val="000000"/>
+                <w:sz w:val="15"/>
+              </w:rPr>
+              <w:t>流入合计+40.46亿 / 流出合计-7.16亿</w:t>
             </w:r>
           </w:p>
         </w:tc>
@@ -14769,7 +14585,6 @@
           </w:tcPr>
           <w:p>
             <w:pPr>
-              <w:pStyle w:val="affd"/>
               <w:spacing w:before="0" w:after="0" w:line="276" w:lineRule="auto"/>
               <w:jc w:val="center"/>
             </w:pPr>
@@ -14794,7 +14609,6 @@
           </w:tcPr>
           <w:p>
             <w:pPr>
-              <w:pStyle w:val="affd"/>
               <w:spacing w:before="0" w:after="0" w:line="276" w:lineRule="auto"/>
               <w:jc w:val="center"/>
             </w:pPr>
@@ -14817,19 +14631,18 @@
           </w:tcPr>
           <w:p>
             <w:pPr>
-              <w:pStyle w:val="affd"/>
-              <w:spacing w:before="0" w:after="0" w:line="276" w:lineRule="auto"/>
-              <w:jc w:val="center"/>
-            </w:pPr>
-            <w:r/>
-            <w:r>
-              <w:rPr>
-                <w:rFonts w:ascii="Times New Roman" w:hAnsi="Times New Roman" w:eastAsia="KaiTi"/>
-                <w:b w:val="0"/>
-                <w:color w:val="000000"/>
-                <w:sz w:val="15"/>
-              </w:rPr>
-              <w:t>+49.78</w:t>
+              <w:spacing w:before="0" w:after="0" w:line="276" w:lineRule="auto"/>
+              <w:jc w:val="center"/>
+            </w:pPr>
+            <w:r/>
+            <w:r>
+              <w:rPr>
+                <w:rFonts w:ascii="Times New Roman" w:hAnsi="Times New Roman" w:eastAsia="KaiTi"/>
+                <w:b w:val="0"/>
+                <w:color w:val="000000"/>
+                <w:sz w:val="15"/>
+              </w:rPr>
+              <w:t>+49.86</w:t>
             </w:r>
           </w:p>
         </w:tc>
@@ -14840,19 +14653,18 @@
           </w:tcPr>
           <w:p>
             <w:pPr>
-              <w:pStyle w:val="affd"/>
-              <w:spacing w:before="0" w:after="0" w:line="276" w:lineRule="auto"/>
-              <w:jc w:val="center"/>
-            </w:pPr>
-            <w:r/>
-            <w:r>
-              <w:rPr>
-                <w:rFonts w:ascii="Times New Roman" w:hAnsi="Times New Roman" w:eastAsia="KaiTi"/>
-                <w:b w:val="0"/>
-                <w:color w:val="000000"/>
-                <w:sz w:val="15"/>
-              </w:rPr>
-              <w:t>流入83只/流出47只（缺10只）</w:t>
+              <w:spacing w:before="0" w:after="0" w:line="276" w:lineRule="auto"/>
+              <w:jc w:val="center"/>
+            </w:pPr>
+            <w:r/>
+            <w:r>
+              <w:rPr>
+                <w:rFonts w:ascii="Times New Roman" w:hAnsi="Times New Roman" w:eastAsia="KaiTi"/>
+                <w:b w:val="0"/>
+                <w:color w:val="000000"/>
+                <w:sz w:val="15"/>
+              </w:rPr>
+              <w:t>流入90只/流出51只（缺11只）</w:t>
             </w:r>
           </w:p>
         </w:tc>
@@ -14863,19 +14675,18 @@
           </w:tcPr>
           <w:p>
             <w:pPr>
-              <w:pStyle w:val="affd"/>
-              <w:spacing w:before="0" w:after="0" w:line="276" w:lineRule="auto"/>
-              <w:jc w:val="center"/>
-            </w:pPr>
-            <w:r/>
-            <w:r>
-              <w:rPr>
-                <w:rFonts w:ascii="Times New Roman" w:hAnsi="Times New Roman" w:eastAsia="KaiTi"/>
-                <w:b w:val="0"/>
-                <w:color w:val="000000"/>
-                <w:sz w:val="15"/>
-              </w:rPr>
-              <w:t>流入合计+61.33亿 / 流出合计-11.55亿</w:t>
+              <w:spacing w:before="0" w:after="0" w:line="276" w:lineRule="auto"/>
+              <w:jc w:val="center"/>
+            </w:pPr>
+            <w:r/>
+            <w:r>
+              <w:rPr>
+                <w:rFonts w:ascii="Times New Roman" w:hAnsi="Times New Roman" w:eastAsia="KaiTi"/>
+                <w:b w:val="0"/>
+                <w:color w:val="000000"/>
+                <w:sz w:val="15"/>
+              </w:rPr>
+              <w:t>流入合计+61.55亿 / 流出合计-11.69亿</w:t>
             </w:r>
           </w:p>
         </w:tc>
@@ -14886,7 +14697,6 @@
           </w:tcPr>
           <w:p>
             <w:pPr>
-              <w:pStyle w:val="affd"/>
               <w:spacing w:before="0" w:after="0" w:line="276" w:lineRule="auto"/>
               <w:jc w:val="center"/>
             </w:pPr>
@@ -14911,7 +14721,6 @@
           </w:tcPr>
           <w:p>
             <w:pPr>
-              <w:pStyle w:val="affd"/>
               <w:spacing w:before="0" w:after="0" w:line="276" w:lineRule="auto"/>
               <w:jc w:val="center"/>
             </w:pPr>
@@ -14934,19 +14743,18 @@
           </w:tcPr>
           <w:p>
             <w:pPr>
-              <w:pStyle w:val="affd"/>
-              <w:spacing w:before="0" w:after="0" w:line="276" w:lineRule="auto"/>
-              <w:jc w:val="center"/>
-            </w:pPr>
-            <w:r/>
-            <w:r>
-              <w:rPr>
-                <w:rFonts w:ascii="Times New Roman" w:hAnsi="Times New Roman" w:eastAsia="KaiTi"/>
-                <w:b w:val="0"/>
-                <w:color w:val="000000"/>
-                <w:sz w:val="15"/>
-              </w:rPr>
-              <w:t>+48.62</w:t>
+              <w:spacing w:before="0" w:after="0" w:line="276" w:lineRule="auto"/>
+              <w:jc w:val="center"/>
+            </w:pPr>
+            <w:r/>
+            <w:r>
+              <w:rPr>
+                <w:rFonts w:ascii="Times New Roman" w:hAnsi="Times New Roman" w:eastAsia="KaiTi"/>
+                <w:b w:val="0"/>
+                <w:color w:val="000000"/>
+                <w:sz w:val="15"/>
+              </w:rPr>
+              <w:t>+48.76</w:t>
             </w:r>
           </w:p>
         </w:tc>
@@ -14957,19 +14765,18 @@
           </w:tcPr>
           <w:p>
             <w:pPr>
-              <w:pStyle w:val="affd"/>
-              <w:spacing w:before="0" w:after="0" w:line="276" w:lineRule="auto"/>
-              <w:jc w:val="center"/>
-            </w:pPr>
-            <w:r/>
-            <w:r>
-              <w:rPr>
-                <w:rFonts w:ascii="Times New Roman" w:hAnsi="Times New Roman" w:eastAsia="KaiTi"/>
-                <w:b w:val="0"/>
-                <w:color w:val="000000"/>
-                <w:sz w:val="15"/>
-              </w:rPr>
-              <w:t>流入88只/流出48只</w:t>
+              <w:spacing w:before="0" w:after="0" w:line="276" w:lineRule="auto"/>
+              <w:jc w:val="center"/>
+            </w:pPr>
+            <w:r/>
+            <w:r>
+              <w:rPr>
+                <w:rFonts w:ascii="Times New Roman" w:hAnsi="Times New Roman" w:eastAsia="KaiTi"/>
+                <w:b w:val="0"/>
+                <w:color w:val="000000"/>
+                <w:sz w:val="15"/>
+              </w:rPr>
+              <w:t>流入97只/流出51只</w:t>
             </w:r>
           </w:p>
         </w:tc>
@@ -14980,19 +14787,18 @@
           </w:tcPr>
           <w:p>
             <w:pPr>
-              <w:pStyle w:val="affd"/>
-              <w:spacing w:before="0" w:after="0" w:line="276" w:lineRule="auto"/>
-              <w:jc w:val="center"/>
-            </w:pPr>
-            <w:r/>
-            <w:r>
-              <w:rPr>
-                <w:rFonts w:ascii="Times New Roman" w:hAnsi="Times New Roman" w:eastAsia="KaiTi"/>
-                <w:b w:val="0"/>
-                <w:color w:val="000000"/>
-                <w:sz w:val="15"/>
-              </w:rPr>
-              <w:t>流入合计+57.27亿 / 流出合计-8.65亿</w:t>
+              <w:spacing w:before="0" w:after="0" w:line="276" w:lineRule="auto"/>
+              <w:jc w:val="center"/>
+            </w:pPr>
+            <w:r/>
+            <w:r>
+              <w:rPr>
+                <w:rFonts w:ascii="Times New Roman" w:hAnsi="Times New Roman" w:eastAsia="KaiTi"/>
+                <w:b w:val="0"/>
+                <w:color w:val="000000"/>
+                <w:sz w:val="15"/>
+              </w:rPr>
+              <w:t>流入合计+57.50亿 / 流出合计-8.74亿</w:t>
             </w:r>
           </w:p>
         </w:tc>
@@ -15003,7 +14809,6 @@
           </w:tcPr>
           <w:p>
             <w:pPr>
-              <w:pStyle w:val="affd"/>
               <w:spacing w:before="0" w:after="0" w:line="276" w:lineRule="auto"/>
               <w:jc w:val="center"/>
             </w:pPr>
@@ -15028,7 +14833,6 @@
           </w:tcPr>
           <w:p>
             <w:pPr>
-              <w:pStyle w:val="affd"/>
               <w:spacing w:before="0" w:after="0" w:line="276" w:lineRule="auto"/>
               <w:jc w:val="center"/>
             </w:pPr>
@@ -15051,19 +14855,18 @@
           </w:tcPr>
           <w:p>
             <w:pPr>
-              <w:pStyle w:val="affd"/>
-              <w:spacing w:before="0" w:after="0" w:line="276" w:lineRule="auto"/>
-              <w:jc w:val="center"/>
-            </w:pPr>
-            <w:r/>
-            <w:r>
-              <w:rPr>
-                <w:rFonts w:ascii="Times New Roman" w:hAnsi="Times New Roman" w:eastAsia="KaiTi"/>
-                <w:b w:val="0"/>
-                <w:color w:val="000000"/>
-                <w:sz w:val="15"/>
-              </w:rPr>
-              <w:t>+81.50</w:t>
+              <w:spacing w:before="0" w:after="0" w:line="276" w:lineRule="auto"/>
+              <w:jc w:val="center"/>
+            </w:pPr>
+            <w:r/>
+            <w:r>
+              <w:rPr>
+                <w:rFonts w:ascii="Times New Roman" w:hAnsi="Times New Roman" w:eastAsia="KaiTi"/>
+                <w:b w:val="0"/>
+                <w:color w:val="000000"/>
+                <w:sz w:val="15"/>
+              </w:rPr>
+              <w:t>+82.20</w:t>
             </w:r>
           </w:p>
         </w:tc>
@@ -15074,19 +14877,18 @@
           </w:tcPr>
           <w:p>
             <w:pPr>
-              <w:pStyle w:val="affd"/>
-              <w:spacing w:before="0" w:after="0" w:line="276" w:lineRule="auto"/>
-              <w:jc w:val="center"/>
-            </w:pPr>
-            <w:r/>
-            <w:r>
-              <w:rPr>
-                <w:rFonts w:ascii="Times New Roman" w:hAnsi="Times New Roman" w:eastAsia="KaiTi"/>
-                <w:b w:val="0"/>
-                <w:color w:val="000000"/>
-                <w:sz w:val="15"/>
-              </w:rPr>
-              <w:t>流入92只/流出36只（缺14只）</w:t>
+              <w:spacing w:before="0" w:after="0" w:line="276" w:lineRule="auto"/>
+              <w:jc w:val="center"/>
+            </w:pPr>
+            <w:r/>
+            <w:r>
+              <w:rPr>
+                <w:rFonts w:ascii="Times New Roman" w:hAnsi="Times New Roman" w:eastAsia="KaiTi"/>
+                <w:b w:val="0"/>
+                <w:color w:val="000000"/>
+                <w:sz w:val="15"/>
+              </w:rPr>
+              <w:t>流入98只/流出38只（缺18只）</w:t>
             </w:r>
           </w:p>
         </w:tc>
@@ -15097,19 +14899,18 @@
           </w:tcPr>
           <w:p>
             <w:pPr>
-              <w:pStyle w:val="affd"/>
-              <w:spacing w:before="0" w:after="0" w:line="276" w:lineRule="auto"/>
-              <w:jc w:val="center"/>
-            </w:pPr>
-            <w:r/>
-            <w:r>
-              <w:rPr>
-                <w:rFonts w:ascii="Times New Roman" w:hAnsi="Times New Roman" w:eastAsia="KaiTi"/>
-                <w:b w:val="0"/>
-                <w:color w:val="000000"/>
-                <w:sz w:val="15"/>
-              </w:rPr>
-              <w:t>流入合计+94.26亿 / 流出合计-12.76亿</w:t>
+              <w:spacing w:before="0" w:after="0" w:line="276" w:lineRule="auto"/>
+              <w:jc w:val="center"/>
+            </w:pPr>
+            <w:r/>
+            <w:r>
+              <w:rPr>
+                <w:rFonts w:ascii="Times New Roman" w:hAnsi="Times New Roman" w:eastAsia="KaiTi"/>
+                <w:b w:val="0"/>
+                <w:color w:val="000000"/>
+                <w:sz w:val="15"/>
+              </w:rPr>
+              <w:t>流入合计+95.22亿 / 流出合计-13.02亿</w:t>
             </w:r>
           </w:p>
         </w:tc>
@@ -15120,7 +14921,6 @@
           </w:tcPr>
           <w:p>
             <w:pPr>
-              <w:pStyle w:val="affd"/>
               <w:spacing w:before="0" w:after="0" w:line="276" w:lineRule="auto"/>
               <w:jc w:val="center"/>
             </w:pPr>
@@ -15145,7 +14945,6 @@
           </w:tcPr>
           <w:p>
             <w:pPr>
-              <w:pStyle w:val="affd"/>
               <w:spacing w:before="0" w:after="0" w:line="276" w:lineRule="auto"/>
               <w:jc w:val="center"/>
             </w:pPr>
@@ -15168,7 +14967,6 @@
           </w:tcPr>
           <w:p>
             <w:pPr>
-              <w:pStyle w:val="affd"/>
               <w:spacing w:before="0" w:after="0" w:line="276" w:lineRule="auto"/>
               <w:jc w:val="center"/>
             </w:pPr>
@@ -15191,19 +14989,18 @@
           </w:tcPr>
           <w:p>
             <w:pPr>
-              <w:pStyle w:val="affd"/>
-              <w:spacing w:before="0" w:after="0" w:line="276" w:lineRule="auto"/>
-              <w:jc w:val="center"/>
-            </w:pPr>
-            <w:r/>
-            <w:r>
-              <w:rPr>
-                <w:rFonts w:ascii="Times New Roman" w:hAnsi="Times New Roman" w:eastAsia="KaiTi"/>
-                <w:b w:val="0"/>
-                <w:color w:val="000000"/>
-                <w:sz w:val="15"/>
-              </w:rPr>
-              <w:t>流入49只/流出7只（缺86只）</w:t>
+              <w:spacing w:before="0" w:after="0" w:line="276" w:lineRule="auto"/>
+              <w:jc w:val="center"/>
+            </w:pPr>
+            <w:r/>
+            <w:r>
+              <w:rPr>
+                <w:rFonts w:ascii="Times New Roman" w:hAnsi="Times New Roman" w:eastAsia="KaiTi"/>
+                <w:b w:val="0"/>
+                <w:color w:val="000000"/>
+                <w:sz w:val="15"/>
+              </w:rPr>
+              <w:t>流入49只/流出7只（缺98只）</w:t>
             </w:r>
           </w:p>
         </w:tc>
@@ -15214,7 +15011,6 @@
           </w:tcPr>
           <w:p>
             <w:pPr>
-              <w:pStyle w:val="affd"/>
               <w:spacing w:before="0" w:after="0" w:line="276" w:lineRule="auto"/>
               <w:jc w:val="center"/>
             </w:pPr>
@@ -15237,7 +15033,6 @@
           </w:tcPr>
           <w:p>
             <w:pPr>
-              <w:pStyle w:val="affd"/>
               <w:spacing w:before="0" w:after="0" w:line="276" w:lineRule="auto"/>
               <w:jc w:val="center"/>
             </w:pPr>
@@ -15282,7 +15077,7 @@
           <w:color w:val="6B7280"/>
           <w:sz w:val="18"/>
         </w:rPr>
-        <w:t>注：Flow_3Yr仅覆盖成立满3年的产品（JPMorgan 3/8只、First Trust 56/142只、Innovator 75/165只、NEOS 1/8只、Global X 16/33只），与较短时间窗口数据不可直接横向对比。流入/流出明细为各产品正/负流向各自加总，两者相抵后等于净流量合计。</w:t>
+        <w:t>注：Flow_3Yr仅覆盖成立满3年的产品（JPMorgan 3/9只、First Trust 56/154只、Innovator 75/165只、NEOS 1/8只、Global X 16/33只），与较短时间窗口数据不可直接横向对比。流入/流出明细为各产品正/负流向各自加总，两者相抵后等于净流量合计。</w:t>
       </w:r>
     </w:p>
     <w:p>
@@ -17562,7 +17357,7 @@
           <w:color w:val="6B7280"/>
           <w:sz w:val="18"/>
         </w:rPr>
-        <w:t>注：Flow_3Yr仅覆盖成立满3年的产品（JPMorgan 3/8只、First Trust 56/142只、Innovator 75/165只、NEOS 1/8只、Global X 16/33只），与较短时间窗口数据不可直接横向对比。流入/流出明细为各产品正/负流向各自加总，两者相抵后等于净流量合计。</w:t>
+        <w:t>注：Flow_3Yr仅覆盖成立满3年的产品（JPMorgan 3/9只、First Trust 56/154只、Innovator 75/165只、NEOS 1/8只、Global X 16/33只），与较短时间窗口数据不可直接横向对比。流入/流出明细为各产品正/负流向各自加总，两者相抵后等于净流量合计。</w:t>
       </w:r>
     </w:p>
     <w:p>
@@ -19140,7 +18935,7 @@
           <w:color w:val="6B7280"/>
           <w:sz w:val="18"/>
         </w:rPr>
-        <w:t>注：Flow_3Yr仅覆盖成立满3年的产品（JPMorgan 3/8只、First Trust 56/142只、Innovator 75/165只、NEOS 1/8只、Global X 16/33只），与较短时间窗口数据不可直接横向对比。流入/流出明细为各产品正/负流向各自加总，两者相抵后等于净流量合计。</w:t>
+        <w:t>注：Flow_3Yr仅覆盖成立满3年的产品（JPMorgan 3/9只、First Trust 56/154只、Innovator 75/165只、NEOS 1/8只、Global X 16/33只），与较短时间窗口数据不可直接横向对比。流入/流出明细为各产品正/负流向各自加总，两者相抵后等于净流量合计。</w:t>
       </w:r>
     </w:p>
     <w:p>
@@ -21535,7 +21330,7 @@
           <w:color w:val="6B7280"/>
           <w:sz w:val="18"/>
         </w:rPr>
-        <w:t>注：Flow_3Yr仅覆盖成立满3年的产品（JPMorgan 3/8只、First Trust 56/142只、Innovator 75/165只、NEOS 1/8只、Global X 16/33只），与较短时间窗口数据不可直接横向对比。流入/流出明细为各产品正/负流向各自加总，两者相抵后等于净流量合计。</w:t>
+        <w:t>注：Flow_3Yr仅覆盖成立满3年的产品（JPMorgan 3/9只、First Trust 56/154只、Innovator 75/165只、NEOS 1/8只、Global X 16/33只），与较短时间窗口数据不可直接横向对比。流入/流出明细为各产品正/负流向各自加总，两者相抵后等于净流量合计。</w:t>
       </w:r>
     </w:p>
     <w:p>

</xml_diff>